<commit_message>
Added a bit to outline
</commit_message>
<xml_diff>
--- a/Scripts/Outlines.docx
+++ b/Scripts/Outlines.docx
@@ -22,338 +22,7 @@
         </w:rPr>
         <w:t>E01 – Introduction</w:t>
       </w:r>
-    </w:p>
-    <w:p>
-      <w:pPr>
-        <w:rPr>
-          <w:rFonts w:ascii="Consolas" w:hAnsi="Consolas" w:cs="Consolas"/>
-          <w:sz w:val="32"/>
-          <w:szCs w:val="32"/>
-        </w:rPr>
-      </w:pPr>
-    </w:p>
-    <w:p>
-      <w:pPr>
-        <w:rPr>
-          <w:rFonts w:ascii="Consolas" w:hAnsi="Consolas" w:cs="Consolas"/>
-          <w:sz w:val="22"/>
-          <w:szCs w:val="22"/>
-        </w:rPr>
-      </w:pPr>
-      <w:r>
-        <w:rPr>
-          <w:rFonts w:ascii="Consolas" w:hAnsi="Consolas" w:cs="Consolas"/>
-          <w:sz w:val="22"/>
-          <w:szCs w:val="22"/>
-        </w:rPr>
-        <w:t>(18.5 Minutes)</w:t>
-      </w:r>
-    </w:p>
-    <w:p>
-      <w:pPr>
-        <w:rPr>
-          <w:rFonts w:ascii="Consolas" w:hAnsi="Consolas" w:cs="Consolas"/>
-          <w:sz w:val="22"/>
-          <w:szCs w:val="22"/>
-        </w:rPr>
-      </w:pPr>
-      <w:r>
-        <w:rPr>
-          <w:rFonts w:ascii="Consolas" w:hAnsi="Consolas" w:cs="Consolas"/>
-          <w:sz w:val="22"/>
-          <w:szCs w:val="22"/>
-        </w:rPr>
-        <w:t>30s - Cold Open</w:t>
-      </w:r>
-    </w:p>
-    <w:p>
-      <w:pPr>
-        <w:rPr>
-          <w:rFonts w:ascii="Consolas" w:hAnsi="Consolas" w:cs="Consolas"/>
-          <w:sz w:val="22"/>
-          <w:szCs w:val="22"/>
-        </w:rPr>
-      </w:pPr>
-      <w:r>
-        <w:rPr>
-          <w:rFonts w:ascii="Consolas" w:hAnsi="Consolas" w:cs="Consolas"/>
-          <w:sz w:val="22"/>
-          <w:szCs w:val="22"/>
-        </w:rPr>
-        <w:t>05s - Title Card</w:t>
-      </w:r>
-    </w:p>
-    <w:p>
-      <w:pPr>
-        <w:rPr>
-          <w:rFonts w:ascii="Consolas" w:hAnsi="Consolas" w:cs="Consolas"/>
-          <w:sz w:val="22"/>
-          <w:szCs w:val="22"/>
-        </w:rPr>
-      </w:pPr>
-      <w:r>
-        <w:rPr>
-          <w:rFonts w:ascii="Consolas" w:hAnsi="Consolas" w:cs="Consolas"/>
-          <w:sz w:val="22"/>
-          <w:szCs w:val="22"/>
-        </w:rPr>
-        <w:t>01m - Course Ideology</w:t>
-      </w:r>
-    </w:p>
-    <w:p>
-      <w:pPr>
-        <w:rPr>
-          <w:rFonts w:ascii="Consolas" w:hAnsi="Consolas" w:cs="Consolas"/>
-          <w:sz w:val="22"/>
-          <w:szCs w:val="22"/>
-        </w:rPr>
-      </w:pPr>
-      <w:r>
-        <w:rPr>
-          <w:rFonts w:ascii="Consolas" w:hAnsi="Consolas" w:cs="Consolas"/>
-          <w:sz w:val="22"/>
-          <w:szCs w:val="22"/>
-        </w:rPr>
-        <w:t xml:space="preserve">02m - </w:t>
-      </w:r>
-      <w:r>
-        <w:rPr>
-          <w:rFonts w:ascii="Consolas" w:hAnsi="Consolas" w:cs="Consolas"/>
-          <w:sz w:val="22"/>
-          <w:szCs w:val="22"/>
-        </w:rPr>
-        <w:t xml:space="preserve">Downloading </w:t>
-      </w:r>
-      <w:proofErr w:type="spellStart"/>
-      <w:r>
-        <w:rPr>
-          <w:rFonts w:ascii="Consolas" w:hAnsi="Consolas" w:cs="Consolas"/>
-          <w:sz w:val="22"/>
-          <w:szCs w:val="22"/>
-        </w:rPr>
-        <w:t>Projucer</w:t>
-      </w:r>
-      <w:proofErr w:type="spellEnd"/>
-    </w:p>
-    <w:p>
-      <w:pPr>
-        <w:rPr>
-          <w:rFonts w:ascii="Consolas" w:hAnsi="Consolas" w:cs="Consolas"/>
-          <w:sz w:val="22"/>
-          <w:szCs w:val="22"/>
-        </w:rPr>
-      </w:pPr>
-      <w:r>
-        <w:rPr>
-          <w:rFonts w:ascii="Consolas" w:hAnsi="Consolas" w:cs="Consolas"/>
-          <w:sz w:val="22"/>
-          <w:szCs w:val="22"/>
-        </w:rPr>
-        <w:t xml:space="preserve">02m - </w:t>
-      </w:r>
-      <w:r>
-        <w:rPr>
-          <w:rFonts w:ascii="Consolas" w:hAnsi="Consolas" w:cs="Consolas"/>
-          <w:sz w:val="22"/>
-          <w:szCs w:val="22"/>
-        </w:rPr>
-        <w:t>Cloning the repo</w:t>
-      </w:r>
-    </w:p>
-    <w:p>
-      <w:pPr>
-        <w:rPr>
-          <w:rFonts w:ascii="Consolas" w:hAnsi="Consolas" w:cs="Consolas"/>
-          <w:sz w:val="22"/>
-          <w:szCs w:val="22"/>
-        </w:rPr>
-      </w:pPr>
-      <w:r>
-        <w:rPr>
-          <w:rFonts w:ascii="Consolas" w:hAnsi="Consolas" w:cs="Consolas"/>
-          <w:sz w:val="22"/>
-          <w:szCs w:val="22"/>
-        </w:rPr>
-        <w:t xml:space="preserve">01m - </w:t>
-      </w:r>
-      <w:r>
-        <w:rPr>
-          <w:rFonts w:ascii="Consolas" w:hAnsi="Consolas" w:cs="Consolas"/>
-          <w:sz w:val="22"/>
-          <w:szCs w:val="22"/>
-        </w:rPr>
-        <w:t>Creating a new project</w:t>
-      </w:r>
-    </w:p>
-    <w:p>
-      <w:pPr>
-        <w:rPr>
-          <w:rFonts w:ascii="Consolas" w:hAnsi="Consolas" w:cs="Consolas"/>
-          <w:sz w:val="22"/>
-          <w:szCs w:val="22"/>
-        </w:rPr>
-      </w:pPr>
-      <w:r>
-        <w:rPr>
-          <w:rFonts w:ascii="Consolas" w:hAnsi="Consolas" w:cs="Consolas"/>
-          <w:sz w:val="22"/>
-          <w:szCs w:val="22"/>
-        </w:rPr>
-        <w:t xml:space="preserve">03m - </w:t>
-      </w:r>
-      <w:r>
-        <w:rPr>
-          <w:rFonts w:ascii="Consolas" w:hAnsi="Consolas" w:cs="Consolas"/>
-          <w:sz w:val="22"/>
-          <w:szCs w:val="22"/>
-        </w:rPr>
-        <w:t>Copying the template</w:t>
-      </w:r>
-    </w:p>
-    <w:p>
-      <w:pPr>
-        <w:rPr>
-          <w:rFonts w:ascii="Consolas" w:hAnsi="Consolas" w:cs="Consolas"/>
-          <w:sz w:val="22"/>
-          <w:szCs w:val="22"/>
-        </w:rPr>
-      </w:pPr>
-      <w:r>
-        <w:rPr>
-          <w:rFonts w:ascii="Consolas" w:hAnsi="Consolas" w:cs="Consolas"/>
-          <w:sz w:val="22"/>
-          <w:szCs w:val="22"/>
-        </w:rPr>
-        <w:t xml:space="preserve">02m - </w:t>
-      </w:r>
-      <w:r>
-        <w:rPr>
-          <w:rFonts w:ascii="Consolas" w:hAnsi="Consolas" w:cs="Consolas"/>
-          <w:sz w:val="22"/>
-          <w:szCs w:val="22"/>
-        </w:rPr>
-        <w:t>Adding clipper DSP</w:t>
-      </w:r>
-    </w:p>
-    <w:p>
-      <w:pPr>
-        <w:rPr>
-          <w:rFonts w:ascii="Consolas" w:hAnsi="Consolas" w:cs="Consolas"/>
-          <w:sz w:val="22"/>
-          <w:szCs w:val="22"/>
-        </w:rPr>
-      </w:pPr>
-      <w:r>
-        <w:rPr>
-          <w:rFonts w:ascii="Consolas" w:hAnsi="Consolas" w:cs="Consolas"/>
-          <w:sz w:val="22"/>
-          <w:szCs w:val="22"/>
-        </w:rPr>
-        <w:t xml:space="preserve">02m - </w:t>
-      </w:r>
-      <w:r>
-        <w:rPr>
-          <w:rFonts w:ascii="Consolas" w:hAnsi="Consolas" w:cs="Consolas"/>
-          <w:sz w:val="22"/>
-          <w:szCs w:val="22"/>
-        </w:rPr>
-        <w:t>Test in Ableton</w:t>
-      </w:r>
-    </w:p>
-    <w:p>
-      <w:pPr>
-        <w:rPr>
-          <w:rFonts w:ascii="Consolas" w:hAnsi="Consolas" w:cs="Consolas"/>
-          <w:sz w:val="22"/>
-          <w:szCs w:val="22"/>
-        </w:rPr>
-      </w:pPr>
-      <w:r>
-        <w:rPr>
-          <w:rFonts w:ascii="Consolas" w:hAnsi="Consolas" w:cs="Consolas"/>
-          <w:sz w:val="22"/>
-          <w:szCs w:val="22"/>
-        </w:rPr>
-        <w:t xml:space="preserve">02m - </w:t>
-      </w:r>
-      <w:r>
-        <w:rPr>
-          <w:rFonts w:ascii="Consolas" w:hAnsi="Consolas" w:cs="Consolas"/>
-          <w:sz w:val="22"/>
-          <w:szCs w:val="22"/>
-        </w:rPr>
-        <w:t>Adding threshold parameter</w:t>
-      </w:r>
-    </w:p>
-    <w:p>
-      <w:pPr>
-        <w:rPr>
-          <w:rFonts w:ascii="Consolas" w:hAnsi="Consolas" w:cs="Consolas"/>
-          <w:sz w:val="22"/>
-          <w:szCs w:val="22"/>
-        </w:rPr>
-      </w:pPr>
-      <w:r>
-        <w:rPr>
-          <w:rFonts w:ascii="Consolas" w:hAnsi="Consolas" w:cs="Consolas"/>
-          <w:sz w:val="22"/>
-          <w:szCs w:val="22"/>
-        </w:rPr>
-        <w:t xml:space="preserve">02m - </w:t>
-      </w:r>
-      <w:r>
-        <w:rPr>
-          <w:rFonts w:ascii="Consolas" w:hAnsi="Consolas" w:cs="Consolas"/>
-          <w:sz w:val="22"/>
-          <w:szCs w:val="22"/>
-        </w:rPr>
-        <w:t>Test in Ableton</w:t>
-      </w:r>
-    </w:p>
-    <w:p>
-      <w:pPr>
-        <w:rPr>
-          <w:rFonts w:ascii="Consolas" w:hAnsi="Consolas" w:cs="Consolas"/>
-          <w:sz w:val="22"/>
-          <w:szCs w:val="22"/>
-        </w:rPr>
-      </w:pPr>
-      <w:r>
-        <w:rPr>
-          <w:rFonts w:ascii="Consolas" w:hAnsi="Consolas" w:cs="Consolas"/>
-          <w:sz w:val="22"/>
-          <w:szCs w:val="22"/>
-        </w:rPr>
-        <w:t xml:space="preserve">01m – </w:t>
-      </w:r>
-      <w:r>
-        <w:rPr>
-          <w:rFonts w:ascii="Consolas" w:hAnsi="Consolas" w:cs="Consolas"/>
-          <w:sz w:val="22"/>
-          <w:szCs w:val="22"/>
-        </w:rPr>
-        <w:t>Close</w:t>
-      </w:r>
-    </w:p>
-    <w:p>
-      <w:pPr>
-        <w:rPr>
-          <w:rFonts w:ascii="Consolas" w:hAnsi="Consolas" w:cs="Consolas"/>
-          <w:sz w:val="22"/>
-          <w:szCs w:val="22"/>
-        </w:rPr>
-      </w:pPr>
-      <w:r>
-        <w:rPr>
-          <w:rFonts w:ascii="Consolas" w:hAnsi="Consolas" w:cs="Consolas"/>
-          <w:sz w:val="22"/>
-          <w:szCs w:val="22"/>
-        </w:rPr>
-        <w:br w:type="page"/>
-      </w:r>
-    </w:p>
-    <w:p>
-      <w:pPr>
+      <w:r>
         <w:rPr>
           <w:rFonts w:ascii="Consolas" w:hAnsi="Consolas" w:cs="Consolas"/>
           <w:b/>
@@ -361,8 +30,383 @@
           <w:sz w:val="32"/>
           <w:szCs w:val="32"/>
         </w:rPr>
-      </w:pPr>
-      <w:r>
+        <w:t>: Your First Plugin</w:t>
+      </w:r>
+    </w:p>
+    <w:p>
+      <w:pPr>
+        <w:rPr>
+          <w:rFonts w:ascii="Consolas" w:hAnsi="Consolas" w:cs="Consolas"/>
+          <w:sz w:val="22"/>
+          <w:szCs w:val="22"/>
+        </w:rPr>
+      </w:pPr>
+      <w:r>
+        <w:rPr>
+          <w:rFonts w:ascii="Consolas" w:hAnsi="Consolas" w:cs="Consolas"/>
+          <w:sz w:val="22"/>
+          <w:szCs w:val="22"/>
+        </w:rPr>
+        <w:t>Using the Templ</w:t>
+      </w:r>
+      <w:r>
+        <w:rPr>
+          <w:rFonts w:ascii="Consolas" w:hAnsi="Consolas" w:cs="Consolas"/>
+          <w:sz w:val="22"/>
+          <w:szCs w:val="22"/>
+        </w:rPr>
+        <w:t xml:space="preserve">ate, </w:t>
+      </w:r>
+      <w:proofErr w:type="gramStart"/>
+      <w:r>
+        <w:rPr>
+          <w:rFonts w:ascii="Consolas" w:hAnsi="Consolas" w:cs="Consolas"/>
+          <w:sz w:val="22"/>
+          <w:szCs w:val="22"/>
+        </w:rPr>
+        <w:t>Making</w:t>
+      </w:r>
+      <w:proofErr w:type="gramEnd"/>
+      <w:r>
+        <w:rPr>
+          <w:rFonts w:ascii="Consolas" w:hAnsi="Consolas" w:cs="Consolas"/>
+          <w:sz w:val="22"/>
+          <w:szCs w:val="22"/>
+        </w:rPr>
+        <w:t xml:space="preserve"> a Hard Clipper, Adding Parameters</w:t>
+      </w:r>
+    </w:p>
+    <w:p>
+      <w:pPr>
+        <w:rPr>
+          <w:rFonts w:ascii="Consolas" w:hAnsi="Consolas" w:cs="Consolas"/>
+          <w:sz w:val="32"/>
+          <w:szCs w:val="32"/>
+        </w:rPr>
+      </w:pPr>
+    </w:p>
+    <w:p>
+      <w:pPr>
+        <w:rPr>
+          <w:rFonts w:ascii="Consolas" w:hAnsi="Consolas" w:cs="Consolas"/>
+          <w:sz w:val="22"/>
+          <w:szCs w:val="22"/>
+        </w:rPr>
+      </w:pPr>
+      <w:r>
+        <w:rPr>
+          <w:rFonts w:ascii="Consolas" w:hAnsi="Consolas" w:cs="Consolas"/>
+          <w:sz w:val="22"/>
+          <w:szCs w:val="22"/>
+        </w:rPr>
+        <w:t>(18.5 Minutes)</w:t>
+      </w:r>
+    </w:p>
+    <w:p>
+      <w:pPr>
+        <w:rPr>
+          <w:rFonts w:ascii="Consolas" w:hAnsi="Consolas" w:cs="Consolas"/>
+          <w:sz w:val="22"/>
+          <w:szCs w:val="22"/>
+        </w:rPr>
+      </w:pPr>
+      <w:r>
+        <w:rPr>
+          <w:rFonts w:ascii="Consolas" w:hAnsi="Consolas" w:cs="Consolas"/>
+          <w:sz w:val="22"/>
+          <w:szCs w:val="22"/>
+        </w:rPr>
+        <w:t>30s - Cold Open</w:t>
+      </w:r>
+    </w:p>
+    <w:p>
+      <w:pPr>
+        <w:rPr>
+          <w:rFonts w:ascii="Consolas" w:hAnsi="Consolas" w:cs="Consolas"/>
+          <w:sz w:val="22"/>
+          <w:szCs w:val="22"/>
+        </w:rPr>
+      </w:pPr>
+      <w:r>
+        <w:rPr>
+          <w:rFonts w:ascii="Consolas" w:hAnsi="Consolas" w:cs="Consolas"/>
+          <w:sz w:val="22"/>
+          <w:szCs w:val="22"/>
+        </w:rPr>
+        <w:t>05s - Title Card</w:t>
+      </w:r>
+    </w:p>
+    <w:p>
+      <w:pPr>
+        <w:rPr>
+          <w:rFonts w:ascii="Consolas" w:hAnsi="Consolas" w:cs="Consolas"/>
+          <w:sz w:val="22"/>
+          <w:szCs w:val="22"/>
+        </w:rPr>
+      </w:pPr>
+      <w:r>
+        <w:rPr>
+          <w:rFonts w:ascii="Consolas" w:hAnsi="Consolas" w:cs="Consolas"/>
+          <w:sz w:val="22"/>
+          <w:szCs w:val="22"/>
+        </w:rPr>
+        <w:t>01m - Course Ideology</w:t>
+      </w:r>
+    </w:p>
+    <w:p>
+      <w:pPr>
+        <w:rPr>
+          <w:rFonts w:ascii="Consolas" w:hAnsi="Consolas" w:cs="Consolas"/>
+          <w:sz w:val="22"/>
+          <w:szCs w:val="22"/>
+        </w:rPr>
+      </w:pPr>
+      <w:r>
+        <w:rPr>
+          <w:rFonts w:ascii="Consolas" w:hAnsi="Consolas" w:cs="Consolas"/>
+          <w:sz w:val="22"/>
+          <w:szCs w:val="22"/>
+        </w:rPr>
+        <w:t xml:space="preserve">02m - </w:t>
+      </w:r>
+      <w:r>
+        <w:rPr>
+          <w:rFonts w:ascii="Consolas" w:hAnsi="Consolas" w:cs="Consolas"/>
+          <w:sz w:val="22"/>
+          <w:szCs w:val="22"/>
+        </w:rPr>
+        <w:t xml:space="preserve">Downloading </w:t>
+      </w:r>
+      <w:proofErr w:type="spellStart"/>
+      <w:r>
+        <w:rPr>
+          <w:rFonts w:ascii="Consolas" w:hAnsi="Consolas" w:cs="Consolas"/>
+          <w:sz w:val="22"/>
+          <w:szCs w:val="22"/>
+        </w:rPr>
+        <w:t>Projucer</w:t>
+      </w:r>
+      <w:proofErr w:type="spellEnd"/>
+    </w:p>
+    <w:p>
+      <w:pPr>
+        <w:rPr>
+          <w:rFonts w:ascii="Consolas" w:hAnsi="Consolas" w:cs="Consolas"/>
+          <w:sz w:val="22"/>
+          <w:szCs w:val="22"/>
+        </w:rPr>
+      </w:pPr>
+      <w:r>
+        <w:rPr>
+          <w:rFonts w:ascii="Consolas" w:hAnsi="Consolas" w:cs="Consolas"/>
+          <w:sz w:val="22"/>
+          <w:szCs w:val="22"/>
+        </w:rPr>
+        <w:t xml:space="preserve">02m - </w:t>
+      </w:r>
+      <w:r>
+        <w:rPr>
+          <w:rFonts w:ascii="Consolas" w:hAnsi="Consolas" w:cs="Consolas"/>
+          <w:sz w:val="22"/>
+          <w:szCs w:val="22"/>
+        </w:rPr>
+        <w:t>Cloning the repo</w:t>
+      </w:r>
+    </w:p>
+    <w:p>
+      <w:pPr>
+        <w:rPr>
+          <w:rFonts w:ascii="Consolas" w:hAnsi="Consolas" w:cs="Consolas"/>
+          <w:sz w:val="22"/>
+          <w:szCs w:val="22"/>
+        </w:rPr>
+      </w:pPr>
+      <w:r>
+        <w:rPr>
+          <w:rFonts w:ascii="Consolas" w:hAnsi="Consolas" w:cs="Consolas"/>
+          <w:sz w:val="22"/>
+          <w:szCs w:val="22"/>
+        </w:rPr>
+        <w:t xml:space="preserve">01m - </w:t>
+      </w:r>
+      <w:r>
+        <w:rPr>
+          <w:rFonts w:ascii="Consolas" w:hAnsi="Consolas" w:cs="Consolas"/>
+          <w:sz w:val="22"/>
+          <w:szCs w:val="22"/>
+        </w:rPr>
+        <w:t>Creating a new project</w:t>
+      </w:r>
+    </w:p>
+    <w:p>
+      <w:pPr>
+        <w:rPr>
+          <w:rFonts w:ascii="Consolas" w:hAnsi="Consolas" w:cs="Consolas"/>
+          <w:sz w:val="22"/>
+          <w:szCs w:val="22"/>
+        </w:rPr>
+      </w:pPr>
+      <w:r>
+        <w:rPr>
+          <w:rFonts w:ascii="Consolas" w:hAnsi="Consolas" w:cs="Consolas"/>
+          <w:sz w:val="22"/>
+          <w:szCs w:val="22"/>
+        </w:rPr>
+        <w:t xml:space="preserve">03m - </w:t>
+      </w:r>
+      <w:r>
+        <w:rPr>
+          <w:rFonts w:ascii="Consolas" w:hAnsi="Consolas" w:cs="Consolas"/>
+          <w:sz w:val="22"/>
+          <w:szCs w:val="22"/>
+        </w:rPr>
+        <w:t>Copying the template</w:t>
+      </w:r>
+    </w:p>
+    <w:p>
+      <w:pPr>
+        <w:rPr>
+          <w:rFonts w:ascii="Consolas" w:hAnsi="Consolas" w:cs="Consolas"/>
+          <w:sz w:val="22"/>
+          <w:szCs w:val="22"/>
+        </w:rPr>
+      </w:pPr>
+      <w:r>
+        <w:rPr>
+          <w:rFonts w:ascii="Consolas" w:hAnsi="Consolas" w:cs="Consolas"/>
+          <w:sz w:val="22"/>
+          <w:szCs w:val="22"/>
+        </w:rPr>
+        <w:t xml:space="preserve">02m - </w:t>
+      </w:r>
+      <w:r>
+        <w:rPr>
+          <w:rFonts w:ascii="Consolas" w:hAnsi="Consolas" w:cs="Consolas"/>
+          <w:sz w:val="22"/>
+          <w:szCs w:val="22"/>
+        </w:rPr>
+        <w:t>Adding clipper DSP</w:t>
+      </w:r>
+    </w:p>
+    <w:p>
+      <w:pPr>
+        <w:rPr>
+          <w:rFonts w:ascii="Consolas" w:hAnsi="Consolas" w:cs="Consolas"/>
+          <w:sz w:val="22"/>
+          <w:szCs w:val="22"/>
+        </w:rPr>
+      </w:pPr>
+      <w:r>
+        <w:rPr>
+          <w:rFonts w:ascii="Consolas" w:hAnsi="Consolas" w:cs="Consolas"/>
+          <w:sz w:val="22"/>
+          <w:szCs w:val="22"/>
+        </w:rPr>
+        <w:t xml:space="preserve">02m - </w:t>
+      </w:r>
+      <w:r>
+        <w:rPr>
+          <w:rFonts w:ascii="Consolas" w:hAnsi="Consolas" w:cs="Consolas"/>
+          <w:sz w:val="22"/>
+          <w:szCs w:val="22"/>
+        </w:rPr>
+        <w:t>Test in Ableton</w:t>
+      </w:r>
+    </w:p>
+    <w:p>
+      <w:pPr>
+        <w:rPr>
+          <w:rFonts w:ascii="Consolas" w:hAnsi="Consolas" w:cs="Consolas"/>
+          <w:sz w:val="22"/>
+          <w:szCs w:val="22"/>
+        </w:rPr>
+      </w:pPr>
+      <w:r>
+        <w:rPr>
+          <w:rFonts w:ascii="Consolas" w:hAnsi="Consolas" w:cs="Consolas"/>
+          <w:sz w:val="22"/>
+          <w:szCs w:val="22"/>
+        </w:rPr>
+        <w:t xml:space="preserve">02m - </w:t>
+      </w:r>
+      <w:r>
+        <w:rPr>
+          <w:rFonts w:ascii="Consolas" w:hAnsi="Consolas" w:cs="Consolas"/>
+          <w:sz w:val="22"/>
+          <w:szCs w:val="22"/>
+        </w:rPr>
+        <w:t>Adding threshold parameter</w:t>
+      </w:r>
+    </w:p>
+    <w:p>
+      <w:pPr>
+        <w:rPr>
+          <w:rFonts w:ascii="Consolas" w:hAnsi="Consolas" w:cs="Consolas"/>
+          <w:sz w:val="22"/>
+          <w:szCs w:val="22"/>
+        </w:rPr>
+      </w:pPr>
+      <w:r>
+        <w:rPr>
+          <w:rFonts w:ascii="Consolas" w:hAnsi="Consolas" w:cs="Consolas"/>
+          <w:sz w:val="22"/>
+          <w:szCs w:val="22"/>
+        </w:rPr>
+        <w:t xml:space="preserve">02m - </w:t>
+      </w:r>
+      <w:r>
+        <w:rPr>
+          <w:rFonts w:ascii="Consolas" w:hAnsi="Consolas" w:cs="Consolas"/>
+          <w:sz w:val="22"/>
+          <w:szCs w:val="22"/>
+        </w:rPr>
+        <w:t>Test in Ableton</w:t>
+      </w:r>
+    </w:p>
+    <w:p>
+      <w:pPr>
+        <w:rPr>
+          <w:rFonts w:ascii="Consolas" w:hAnsi="Consolas" w:cs="Consolas"/>
+          <w:sz w:val="22"/>
+          <w:szCs w:val="22"/>
+        </w:rPr>
+      </w:pPr>
+      <w:r>
+        <w:rPr>
+          <w:rFonts w:ascii="Consolas" w:hAnsi="Consolas" w:cs="Consolas"/>
+          <w:sz w:val="22"/>
+          <w:szCs w:val="22"/>
+        </w:rPr>
+        <w:t xml:space="preserve">01m – </w:t>
+      </w:r>
+      <w:r>
+        <w:rPr>
+          <w:rFonts w:ascii="Consolas" w:hAnsi="Consolas" w:cs="Consolas"/>
+          <w:sz w:val="22"/>
+          <w:szCs w:val="22"/>
+        </w:rPr>
+        <w:t>Close</w:t>
+      </w:r>
+    </w:p>
+    <w:p>
+      <w:pPr>
+        <w:rPr>
+          <w:rFonts w:ascii="Consolas" w:hAnsi="Consolas" w:cs="Consolas"/>
+          <w:sz w:val="22"/>
+          <w:szCs w:val="22"/>
+        </w:rPr>
+      </w:pPr>
+      <w:r>
+        <w:rPr>
+          <w:rFonts w:ascii="Consolas" w:hAnsi="Consolas" w:cs="Consolas"/>
+          <w:sz w:val="22"/>
+          <w:szCs w:val="22"/>
+        </w:rPr>
+        <w:br w:type="page"/>
+      </w:r>
+    </w:p>
+    <w:p>
+      <w:pPr>
         <w:rPr>
           <w:rFonts w:ascii="Consolas" w:hAnsi="Consolas" w:cs="Consolas"/>
           <w:b/>
@@ -370,6 +414,15 @@
           <w:sz w:val="32"/>
           <w:szCs w:val="32"/>
         </w:rPr>
+      </w:pPr>
+      <w:r>
+        <w:rPr>
+          <w:rFonts w:ascii="Consolas" w:hAnsi="Consolas" w:cs="Consolas"/>
+          <w:b/>
+          <w:bCs/>
+          <w:sz w:val="32"/>
+          <w:szCs w:val="32"/>
+        </w:rPr>
         <w:lastRenderedPageBreak/>
         <w:t>E0</w:t>
       </w:r>
@@ -402,6 +455,370 @@
           <w:szCs w:val="32"/>
         </w:rPr>
         <w:t>Nyquist and Sampling</w:t>
+      </w:r>
+    </w:p>
+    <w:p>
+      <w:pPr>
+        <w:rPr>
+          <w:rFonts w:ascii="Consolas" w:hAnsi="Consolas" w:cs="Consolas"/>
+          <w:sz w:val="22"/>
+          <w:szCs w:val="22"/>
+        </w:rPr>
+      </w:pPr>
+      <w:r>
+        <w:rPr>
+          <w:rFonts w:ascii="Consolas" w:hAnsi="Consolas" w:cs="Consolas"/>
+          <w:sz w:val="22"/>
+          <w:szCs w:val="22"/>
+        </w:rPr>
+        <w:t>Continuous vs. Discrete, Sampling Rate, Nyquist Sampling Theorem and Aliasing</w:t>
+      </w:r>
+    </w:p>
+    <w:p>
+      <w:pPr>
+        <w:rPr>
+          <w:rFonts w:ascii="Consolas" w:hAnsi="Consolas" w:cs="Consolas"/>
+          <w:sz w:val="32"/>
+          <w:szCs w:val="32"/>
+        </w:rPr>
+      </w:pPr>
+    </w:p>
+    <w:p>
+      <w:pPr>
+        <w:rPr>
+          <w:rFonts w:ascii="Consolas" w:hAnsi="Consolas" w:cs="Consolas"/>
+          <w:sz w:val="22"/>
+          <w:szCs w:val="22"/>
+        </w:rPr>
+      </w:pPr>
+      <w:r>
+        <w:rPr>
+          <w:rFonts w:ascii="Consolas" w:hAnsi="Consolas" w:cs="Consolas"/>
+          <w:sz w:val="22"/>
+          <w:szCs w:val="22"/>
+        </w:rPr>
+        <w:t>(x minutes)</w:t>
+      </w:r>
+    </w:p>
+    <w:p>
+      <w:pPr>
+        <w:rPr>
+          <w:rFonts w:ascii="Consolas" w:hAnsi="Consolas" w:cs="Consolas"/>
+          <w:sz w:val="22"/>
+          <w:szCs w:val="22"/>
+        </w:rPr>
+      </w:pPr>
+      <w:r>
+        <w:rPr>
+          <w:rFonts w:ascii="Consolas" w:hAnsi="Consolas" w:cs="Consolas"/>
+          <w:sz w:val="22"/>
+          <w:szCs w:val="22"/>
+        </w:rPr>
+        <w:t>30s - Cold Open</w:t>
+      </w:r>
+    </w:p>
+    <w:p>
+      <w:pPr>
+        <w:rPr>
+          <w:rFonts w:ascii="Consolas" w:hAnsi="Consolas" w:cs="Consolas"/>
+          <w:sz w:val="22"/>
+          <w:szCs w:val="22"/>
+        </w:rPr>
+      </w:pPr>
+      <w:r>
+        <w:rPr>
+          <w:rFonts w:ascii="Consolas" w:hAnsi="Consolas" w:cs="Consolas"/>
+          <w:sz w:val="22"/>
+          <w:szCs w:val="22"/>
+        </w:rPr>
+        <w:br w:type="page"/>
+      </w:r>
+    </w:p>
+    <w:p>
+      <w:pPr>
+        <w:rPr>
+          <w:rFonts w:ascii="Consolas" w:hAnsi="Consolas" w:cs="Consolas"/>
+          <w:b/>
+          <w:bCs/>
+          <w:sz w:val="32"/>
+          <w:szCs w:val="32"/>
+        </w:rPr>
+      </w:pPr>
+      <w:r>
+        <w:rPr>
+          <w:rFonts w:ascii="Consolas" w:hAnsi="Consolas" w:cs="Consolas"/>
+          <w:b/>
+          <w:bCs/>
+          <w:sz w:val="32"/>
+          <w:szCs w:val="32"/>
+        </w:rPr>
+        <w:lastRenderedPageBreak/>
+        <w:t>E0</w:t>
+      </w:r>
+      <w:r>
+        <w:rPr>
+          <w:rFonts w:ascii="Consolas" w:hAnsi="Consolas" w:cs="Consolas"/>
+          <w:b/>
+          <w:bCs/>
+          <w:sz w:val="32"/>
+          <w:szCs w:val="32"/>
+        </w:rPr>
+        <w:t>3</w:t>
+      </w:r>
+      <w:r>
+        <w:rPr>
+          <w:rFonts w:ascii="Consolas" w:hAnsi="Consolas" w:cs="Consolas"/>
+          <w:b/>
+          <w:bCs/>
+          <w:sz w:val="32"/>
+          <w:szCs w:val="32"/>
+        </w:rPr>
+        <w:t xml:space="preserve"> – </w:t>
+      </w:r>
+      <w:r>
+        <w:rPr>
+          <w:rFonts w:ascii="Consolas" w:hAnsi="Consolas" w:cs="Consolas"/>
+          <w:b/>
+          <w:bCs/>
+          <w:sz w:val="32"/>
+          <w:szCs w:val="32"/>
+        </w:rPr>
+        <w:t>Plugins</w:t>
+      </w:r>
+      <w:r>
+        <w:rPr>
+          <w:rFonts w:ascii="Consolas" w:hAnsi="Consolas" w:cs="Consolas"/>
+          <w:b/>
+          <w:bCs/>
+          <w:sz w:val="32"/>
+          <w:szCs w:val="32"/>
+        </w:rPr>
+        <w:t>:</w:t>
+      </w:r>
+      <w:r>
+        <w:rPr>
+          <w:rFonts w:ascii="Consolas" w:hAnsi="Consolas" w:cs="Consolas"/>
+          <w:b/>
+          <w:bCs/>
+          <w:sz w:val="32"/>
+          <w:szCs w:val="32"/>
+        </w:rPr>
+        <w:t xml:space="preserve"> Do’s and Don’ts</w:t>
+      </w:r>
+    </w:p>
+    <w:p>
+      <w:pPr>
+        <w:rPr>
+          <w:rFonts w:ascii="Consolas" w:hAnsi="Consolas" w:cs="Consolas"/>
+          <w:sz w:val="22"/>
+          <w:szCs w:val="22"/>
+        </w:rPr>
+      </w:pPr>
+      <w:r>
+        <w:rPr>
+          <w:rFonts w:ascii="Consolas" w:hAnsi="Consolas" w:cs="Consolas"/>
+          <w:sz w:val="22"/>
+          <w:szCs w:val="22"/>
+        </w:rPr>
+        <w:t>Real-Time Audio, Buffer Size &amp; Runtime, Pre-Allocation and the Stack</w:t>
+      </w:r>
+    </w:p>
+    <w:p>
+      <w:pPr>
+        <w:rPr>
+          <w:rFonts w:ascii="Consolas" w:hAnsi="Consolas" w:cs="Consolas"/>
+          <w:sz w:val="32"/>
+          <w:szCs w:val="32"/>
+        </w:rPr>
+      </w:pPr>
+    </w:p>
+    <w:p>
+      <w:pPr>
+        <w:rPr>
+          <w:rFonts w:ascii="Consolas" w:hAnsi="Consolas" w:cs="Consolas"/>
+          <w:sz w:val="22"/>
+          <w:szCs w:val="22"/>
+        </w:rPr>
+      </w:pPr>
+      <w:r>
+        <w:rPr>
+          <w:rFonts w:ascii="Consolas" w:hAnsi="Consolas" w:cs="Consolas"/>
+          <w:sz w:val="22"/>
+          <w:szCs w:val="22"/>
+        </w:rPr>
+        <w:t>(x minutes)</w:t>
+      </w:r>
+    </w:p>
+    <w:p>
+      <w:pPr>
+        <w:rPr>
+          <w:rFonts w:ascii="Consolas" w:hAnsi="Consolas" w:cs="Consolas"/>
+          <w:sz w:val="22"/>
+          <w:szCs w:val="22"/>
+        </w:rPr>
+      </w:pPr>
+      <w:r>
+        <w:rPr>
+          <w:rFonts w:ascii="Consolas" w:hAnsi="Consolas" w:cs="Consolas"/>
+          <w:sz w:val="22"/>
+          <w:szCs w:val="22"/>
+        </w:rPr>
+        <w:t>30s - Cold Open</w:t>
+      </w:r>
+    </w:p>
+    <w:p>
+      <w:pPr>
+        <w:rPr>
+          <w:rFonts w:ascii="Consolas" w:hAnsi="Consolas" w:cs="Consolas"/>
+          <w:sz w:val="22"/>
+          <w:szCs w:val="22"/>
+        </w:rPr>
+      </w:pPr>
+      <w:r>
+        <w:rPr>
+          <w:rFonts w:ascii="Consolas" w:hAnsi="Consolas" w:cs="Consolas"/>
+          <w:sz w:val="22"/>
+          <w:szCs w:val="22"/>
+        </w:rPr>
+        <w:br w:type="page"/>
+      </w:r>
+    </w:p>
+    <w:p>
+      <w:pPr>
+        <w:rPr>
+          <w:rFonts w:ascii="Consolas" w:hAnsi="Consolas" w:cs="Consolas"/>
+          <w:b/>
+          <w:bCs/>
+          <w:sz w:val="32"/>
+          <w:szCs w:val="32"/>
+        </w:rPr>
+      </w:pPr>
+      <w:r>
+        <w:rPr>
+          <w:rFonts w:ascii="Consolas" w:hAnsi="Consolas" w:cs="Consolas"/>
+          <w:b/>
+          <w:bCs/>
+          <w:sz w:val="32"/>
+          <w:szCs w:val="32"/>
+        </w:rPr>
+        <w:lastRenderedPageBreak/>
+        <w:t>E04 – Classes: Making Our Own Toolkit</w:t>
+      </w:r>
+    </w:p>
+    <w:p>
+      <w:pPr>
+        <w:rPr>
+          <w:rFonts w:ascii="Consolas" w:hAnsi="Consolas" w:cs="Consolas"/>
+          <w:sz w:val="22"/>
+          <w:szCs w:val="22"/>
+        </w:rPr>
+      </w:pPr>
+      <w:r>
+        <w:rPr>
+          <w:rFonts w:ascii="Consolas" w:hAnsi="Consolas" w:cs="Consolas"/>
+          <w:sz w:val="22"/>
+          <w:szCs w:val="22"/>
+        </w:rPr>
+        <w:t>SUBTITLE</w:t>
+      </w:r>
+    </w:p>
+    <w:p>
+      <w:pPr>
+        <w:rPr>
+          <w:rFonts w:ascii="Consolas" w:hAnsi="Consolas" w:cs="Consolas"/>
+          <w:sz w:val="32"/>
+          <w:szCs w:val="32"/>
+        </w:rPr>
+      </w:pPr>
+    </w:p>
+    <w:p>
+      <w:pPr>
+        <w:rPr>
+          <w:rFonts w:ascii="Consolas" w:hAnsi="Consolas" w:cs="Consolas"/>
+          <w:sz w:val="22"/>
+          <w:szCs w:val="22"/>
+        </w:rPr>
+      </w:pPr>
+      <w:r>
+        <w:rPr>
+          <w:rFonts w:ascii="Consolas" w:hAnsi="Consolas" w:cs="Consolas"/>
+          <w:sz w:val="22"/>
+          <w:szCs w:val="22"/>
+        </w:rPr>
+        <w:t>(x minutes)</w:t>
+      </w:r>
+    </w:p>
+    <w:p>
+      <w:pPr>
+        <w:rPr>
+          <w:rFonts w:ascii="Consolas" w:hAnsi="Consolas" w:cs="Consolas"/>
+          <w:sz w:val="22"/>
+          <w:szCs w:val="22"/>
+        </w:rPr>
+      </w:pPr>
+      <w:r>
+        <w:rPr>
+          <w:rFonts w:ascii="Consolas" w:hAnsi="Consolas" w:cs="Consolas"/>
+          <w:sz w:val="22"/>
+          <w:szCs w:val="22"/>
+        </w:rPr>
+        <w:t>30s - Cold Open</w:t>
+      </w:r>
+    </w:p>
+    <w:p>
+      <w:pPr>
+        <w:rPr>
+          <w:rFonts w:ascii="Consolas" w:hAnsi="Consolas" w:cs="Consolas"/>
+          <w:sz w:val="22"/>
+          <w:szCs w:val="22"/>
+        </w:rPr>
+      </w:pPr>
+      <w:r>
+        <w:rPr>
+          <w:rFonts w:ascii="Consolas" w:hAnsi="Consolas" w:cs="Consolas"/>
+          <w:sz w:val="22"/>
+          <w:szCs w:val="22"/>
+        </w:rPr>
+        <w:br w:type="page"/>
+      </w:r>
+    </w:p>
+    <w:p>
+      <w:pPr>
+        <w:rPr>
+          <w:rFonts w:ascii="Consolas" w:hAnsi="Consolas" w:cs="Consolas"/>
+          <w:b/>
+          <w:bCs/>
+          <w:sz w:val="32"/>
+          <w:szCs w:val="32"/>
+        </w:rPr>
+      </w:pPr>
+      <w:r>
+        <w:rPr>
+          <w:rFonts w:ascii="Consolas" w:hAnsi="Consolas" w:cs="Consolas"/>
+          <w:b/>
+          <w:bCs/>
+          <w:sz w:val="32"/>
+          <w:szCs w:val="32"/>
+        </w:rPr>
+        <w:lastRenderedPageBreak/>
+        <w:t>E05 – Ring Buffer and Delay Line</w:t>
+      </w:r>
+    </w:p>
+    <w:p>
+      <w:pPr>
+        <w:rPr>
+          <w:rFonts w:ascii="Consolas" w:hAnsi="Consolas" w:cs="Consolas"/>
+          <w:sz w:val="22"/>
+          <w:szCs w:val="22"/>
+        </w:rPr>
+      </w:pPr>
+      <w:r>
+        <w:rPr>
+          <w:rFonts w:ascii="Consolas" w:hAnsi="Consolas" w:cs="Consolas"/>
+          <w:sz w:val="22"/>
+          <w:szCs w:val="22"/>
+        </w:rPr>
+        <w:t>Circular Buffers, Read/Write Heads, Simple Delay Plugin</w:t>
       </w:r>
     </w:p>
     <w:p>

</xml_diff>

<commit_message>
Added todos to main README
</commit_message>
<xml_diff>
--- a/Scripts/Outlines.docx
+++ b/Scripts/Outlines.docx
@@ -127,6 +127,15 @@
           <w:szCs w:val="22"/>
         </w:rPr>
       </w:pPr>
+    </w:p>
+    <w:p>
+      <w:pPr>
+        <w:rPr>
+          <w:rFonts w:ascii="Consolas" w:hAnsi="Consolas" w:cs="Consolas"/>
+          <w:sz w:val="22"/>
+          <w:szCs w:val="22"/>
+        </w:rPr>
+      </w:pPr>
       <w:r>
         <w:rPr>
           <w:rFonts w:ascii="Consolas" w:hAnsi="Consolas" w:cs="Consolas"/>
@@ -135,15 +144,6 @@
         </w:rPr>
         <w:t>05s - Title Card</w:t>
       </w:r>
-    </w:p>
-    <w:p>
-      <w:pPr>
-        <w:rPr>
-          <w:rFonts w:ascii="Consolas" w:hAnsi="Consolas" w:cs="Consolas"/>
-          <w:sz w:val="22"/>
-          <w:szCs w:val="22"/>
-        </w:rPr>
-      </w:pPr>
     </w:p>
     <w:p>
       <w:pPr>

</xml_diff>

<commit_message>
Added git idea to xtras
</commit_message>
<xml_diff>
--- a/Scripts/Outlines.docx
+++ b/Scripts/Outlines.docx
@@ -99,7 +99,23 @@
           <w:sz w:val="22"/>
           <w:szCs w:val="22"/>
         </w:rPr>
-        <w:t>(18.5 Minutes)</w:t>
+        <w:t>(1</w:t>
+      </w:r>
+      <w:r>
+        <w:rPr>
+          <w:rFonts w:ascii="Consolas" w:hAnsi="Consolas" w:cs="Consolas"/>
+          <w:sz w:val="22"/>
+          <w:szCs w:val="22"/>
+        </w:rPr>
+        <w:t>7</w:t>
+      </w:r>
+      <w:r>
+        <w:rPr>
+          <w:rFonts w:ascii="Consolas" w:hAnsi="Consolas" w:cs="Consolas"/>
+          <w:sz w:val="22"/>
+          <w:szCs w:val="22"/>
+        </w:rPr>
+        <w:t>.5 Minutes)</w:t>
       </w:r>
     </w:p>
     <w:p>
@@ -121,128 +137,6 @@
     </w:p>
     <w:p>
       <w:pPr>
-        <w:rPr>
-          <w:rFonts w:ascii="Consolas" w:hAnsi="Consolas" w:cs="Consolas"/>
-          <w:sz w:val="22"/>
-          <w:szCs w:val="22"/>
-        </w:rPr>
-      </w:pPr>
-    </w:p>
-    <w:p>
-      <w:pPr>
-        <w:rPr>
-          <w:rFonts w:ascii="Consolas" w:hAnsi="Consolas" w:cs="Consolas"/>
-          <w:sz w:val="22"/>
-          <w:szCs w:val="22"/>
-        </w:rPr>
-      </w:pPr>
-      <w:r>
-        <w:rPr>
-          <w:rFonts w:ascii="Consolas" w:hAnsi="Consolas" w:cs="Consolas"/>
-          <w:sz w:val="22"/>
-          <w:szCs w:val="22"/>
-        </w:rPr>
-        <w:t>05s - Title Card</w:t>
-      </w:r>
-    </w:p>
-    <w:p>
-      <w:pPr>
-        <w:rPr>
-          <w:rFonts w:ascii="Consolas" w:hAnsi="Consolas" w:cs="Consolas"/>
-          <w:sz w:val="22"/>
-          <w:szCs w:val="22"/>
-        </w:rPr>
-      </w:pPr>
-      <w:r>
-        <w:rPr>
-          <w:rFonts w:ascii="Consolas" w:hAnsi="Consolas" w:cs="Consolas"/>
-          <w:sz w:val="22"/>
-          <w:szCs w:val="22"/>
-        </w:rPr>
-        <w:t>01m - Course Ideology</w:t>
-      </w:r>
-    </w:p>
-    <w:p>
-      <w:pPr>
-        <w:rPr>
-          <w:rFonts w:ascii="Consolas" w:hAnsi="Consolas" w:cs="Consolas"/>
-          <w:sz w:val="22"/>
-          <w:szCs w:val="22"/>
-        </w:rPr>
-      </w:pPr>
-    </w:p>
-    <w:p>
-      <w:pPr>
-        <w:rPr>
-          <w:rFonts w:ascii="Consolas" w:hAnsi="Consolas" w:cs="Consolas"/>
-          <w:sz w:val="22"/>
-          <w:szCs w:val="22"/>
-        </w:rPr>
-      </w:pPr>
-      <w:r>
-        <w:rPr>
-          <w:rFonts w:ascii="Consolas" w:hAnsi="Consolas" w:cs="Consolas"/>
-          <w:sz w:val="22"/>
-          <w:szCs w:val="22"/>
-        </w:rPr>
-        <w:t xml:space="preserve">02m - </w:t>
-      </w:r>
-      <w:r>
-        <w:rPr>
-          <w:rFonts w:ascii="Consolas" w:hAnsi="Consolas" w:cs="Consolas"/>
-          <w:sz w:val="22"/>
-          <w:szCs w:val="22"/>
-        </w:rPr>
-        <w:t>Cloning the repo</w:t>
-      </w:r>
-    </w:p>
-    <w:p>
-      <w:pPr>
-        <w:rPr>
-          <w:rFonts w:ascii="Consolas" w:hAnsi="Consolas" w:cs="Consolas"/>
-          <w:sz w:val="22"/>
-          <w:szCs w:val="22"/>
-        </w:rPr>
-      </w:pPr>
-    </w:p>
-    <w:p>
-      <w:pPr>
-        <w:rPr>
-          <w:rFonts w:ascii="Consolas" w:hAnsi="Consolas" w:cs="Consolas"/>
-          <w:sz w:val="22"/>
-          <w:szCs w:val="22"/>
-        </w:rPr>
-      </w:pPr>
-      <w:r>
-        <w:rPr>
-          <w:rFonts w:ascii="Consolas" w:hAnsi="Consolas" w:cs="Consolas"/>
-          <w:sz w:val="22"/>
-          <w:szCs w:val="22"/>
-        </w:rPr>
-        <w:t xml:space="preserve">02m - </w:t>
-      </w:r>
-      <w:r>
-        <w:rPr>
-          <w:rFonts w:ascii="Consolas" w:hAnsi="Consolas" w:cs="Consolas"/>
-          <w:sz w:val="22"/>
-          <w:szCs w:val="22"/>
-        </w:rPr>
-        <w:t xml:space="preserve">Downloading </w:t>
-      </w:r>
-      <w:proofErr w:type="spellStart"/>
-      <w:r>
-        <w:rPr>
-          <w:rFonts w:ascii="Consolas" w:hAnsi="Consolas" w:cs="Consolas"/>
-          <w:sz w:val="22"/>
-          <w:szCs w:val="22"/>
-        </w:rPr>
-        <w:t>Projucer</w:t>
-      </w:r>
-      <w:proofErr w:type="spellEnd"/>
-    </w:p>
-    <w:p>
-      <w:pPr>
-        <w:ind w:firstLine="720"/>
         <w:rPr>
           <w:rFonts w:ascii="Consolas" w:hAnsi="Consolas" w:cs="Consolas"/>
           <w:sz w:val="20"/>
@@ -252,227 +146,419 @@
       <w:r>
         <w:rPr>
           <w:rFonts w:ascii="Consolas" w:hAnsi="Consolas" w:cs="Consolas"/>
+          <w:sz w:val="22"/>
+          <w:szCs w:val="22"/>
+        </w:rPr>
+        <w:tab/>
+      </w:r>
+      <w:r>
+        <w:rPr>
+          <w:rFonts w:ascii="Consolas" w:hAnsi="Consolas" w:cs="Consolas"/>
           <w:sz w:val="20"/>
           <w:szCs w:val="20"/>
         </w:rPr>
-        <w:t>juce.com. “GET JUCE” (top right). “Download” on STARTER. Clone from GitHub as an option, recommend choosing version to download. Extract zip file, and place in Applications, or wherever you are likely to remember it. Double click “</w:t>
-      </w:r>
-      <w:proofErr w:type="spellStart"/>
-      <w:r>
+        <w:t>In this course, you will learn how to get started making your own real-time audio plugins! For the purpose of ease, we will be using the JUCE framework, but the course has been designed to teach concepts in a way that can be transferred to any platform. By the end of the first semester, which covers twelve episodes and culminates in a midterm project, you will have enough knowledge to create a basic synthesizer with a small collection of effects!</w:t>
+      </w:r>
+    </w:p>
+    <w:p>
+      <w:pPr>
+        <w:ind w:firstLine="720"/>
         <w:rPr>
           <w:rFonts w:ascii="Consolas" w:hAnsi="Consolas" w:cs="Consolas"/>
           <w:sz w:val="20"/>
           <w:szCs w:val="20"/>
         </w:rPr>
-        <w:t>Projucer</w:t>
-      </w:r>
-      <w:proofErr w:type="spellEnd"/>
+      </w:pPr>
       <w:r>
         <w:rPr>
           <w:rFonts w:ascii="Consolas" w:hAnsi="Consolas" w:cs="Consolas"/>
           <w:sz w:val="20"/>
           <w:szCs w:val="20"/>
         </w:rPr>
-        <w:t>” app. If it pops up with a warning that the app downloaded from the internet, press Open anyway.</w:t>
-      </w:r>
-    </w:p>
-    <w:p>
-      <w:pPr>
-        <w:rPr>
-          <w:rFonts w:ascii="Consolas" w:hAnsi="Consolas" w:cs="Consolas"/>
-          <w:sz w:val="22"/>
-          <w:szCs w:val="22"/>
-        </w:rPr>
-      </w:pPr>
-      <w:r>
-        <w:rPr>
-          <w:rFonts w:ascii="Consolas" w:hAnsi="Consolas" w:cs="Consolas"/>
-          <w:sz w:val="22"/>
-          <w:szCs w:val="22"/>
-        </w:rPr>
-        <w:t xml:space="preserve">01m - </w:t>
-      </w:r>
-      <w:r>
-        <w:rPr>
-          <w:rFonts w:ascii="Consolas" w:hAnsi="Consolas" w:cs="Consolas"/>
-          <w:sz w:val="22"/>
-          <w:szCs w:val="22"/>
-        </w:rPr>
-        <w:t>Creating a new project</w:t>
-      </w:r>
-    </w:p>
-    <w:p>
-      <w:pPr>
-        <w:rPr>
-          <w:rFonts w:ascii="Consolas" w:hAnsi="Consolas" w:cs="Consolas"/>
-          <w:sz w:val="22"/>
-          <w:szCs w:val="22"/>
-        </w:rPr>
-      </w:pPr>
-      <w:r>
-        <w:rPr>
-          <w:rFonts w:ascii="Consolas" w:hAnsi="Consolas" w:cs="Consolas"/>
-          <w:sz w:val="22"/>
-          <w:szCs w:val="22"/>
-        </w:rPr>
-        <w:tab/>
-      </w:r>
-      <w:r>
+        <w:t>The course expects you are familiar with basic C++ syntax and concepts before beginning, but no digital signal processing knowledge is needed in advance.</w:t>
+      </w:r>
+    </w:p>
+    <w:p>
+      <w:pPr>
+        <w:rPr>
+          <w:rFonts w:ascii="Consolas" w:hAnsi="Consolas" w:cs="Consolas"/>
+          <w:sz w:val="22"/>
+          <w:szCs w:val="22"/>
+        </w:rPr>
+      </w:pPr>
+      <w:r>
+        <w:rPr>
+          <w:rFonts w:ascii="Consolas" w:hAnsi="Consolas" w:cs="Consolas"/>
+          <w:sz w:val="22"/>
+          <w:szCs w:val="22"/>
+        </w:rPr>
+        <w:t>05s - Title Card</w:t>
+      </w:r>
+    </w:p>
+    <w:p>
+      <w:pPr>
+        <w:rPr>
+          <w:rFonts w:ascii="Consolas" w:hAnsi="Consolas" w:cs="Consolas"/>
+          <w:sz w:val="22"/>
+          <w:szCs w:val="22"/>
+        </w:rPr>
+      </w:pPr>
+      <w:r>
+        <w:rPr>
+          <w:rFonts w:ascii="Consolas" w:hAnsi="Consolas" w:cs="Consolas"/>
+          <w:sz w:val="22"/>
+          <w:szCs w:val="22"/>
+        </w:rPr>
+        <w:t xml:space="preserve">02m - </w:t>
+      </w:r>
+      <w:r>
+        <w:rPr>
+          <w:rFonts w:ascii="Consolas" w:hAnsi="Consolas" w:cs="Consolas"/>
+          <w:sz w:val="22"/>
+          <w:szCs w:val="22"/>
+        </w:rPr>
+        <w:t>Cloning the repo</w:t>
+      </w:r>
+    </w:p>
+    <w:p>
+      <w:pPr>
         <w:rPr>
           <w:rFonts w:ascii="Consolas" w:hAnsi="Consolas" w:cs="Consolas"/>
           <w:sz w:val="20"/>
           <w:szCs w:val="20"/>
         </w:rPr>
-        <w:t>Default opens to New Project screen. In future, go to “File-&gt;New Project.” Choose “Plugin-&gt;Basic.” Add your plugin’s name in Project Name. Should have no spaces. Recommend leaving all modules as they are. Choose Xcode as exporter if on Mac, Visual Studio if on Windows. Press “Create Project.”</w:t>
-      </w:r>
-    </w:p>
-    <w:p>
-      <w:pPr>
-        <w:rPr>
-          <w:rFonts w:ascii="Consolas" w:hAnsi="Consolas" w:cs="Consolas"/>
-          <w:sz w:val="22"/>
-          <w:szCs w:val="22"/>
-        </w:rPr>
-      </w:pPr>
-      <w:r>
-        <w:rPr>
-          <w:rFonts w:ascii="Consolas" w:hAnsi="Consolas" w:cs="Consolas"/>
-          <w:sz w:val="22"/>
-          <w:szCs w:val="22"/>
-        </w:rPr>
-        <w:t xml:space="preserve">03m - </w:t>
-      </w:r>
-      <w:r>
-        <w:rPr>
-          <w:rFonts w:ascii="Consolas" w:hAnsi="Consolas" w:cs="Consolas"/>
-          <w:sz w:val="22"/>
-          <w:szCs w:val="22"/>
-        </w:rPr>
-        <w:t>Copying the template</w:t>
-      </w:r>
-    </w:p>
-    <w:p>
-      <w:pPr>
-        <w:rPr>
-          <w:rFonts w:ascii="Consolas" w:hAnsi="Consolas" w:cs="Consolas"/>
-          <w:sz w:val="22"/>
-          <w:szCs w:val="22"/>
-        </w:rPr>
-      </w:pPr>
-    </w:p>
-    <w:p>
-      <w:pPr>
-        <w:rPr>
-          <w:rFonts w:ascii="Consolas" w:hAnsi="Consolas" w:cs="Consolas"/>
-          <w:sz w:val="22"/>
-          <w:szCs w:val="22"/>
-        </w:rPr>
-      </w:pPr>
-      <w:r>
-        <w:rPr>
-          <w:rFonts w:ascii="Consolas" w:hAnsi="Consolas" w:cs="Consolas"/>
-          <w:sz w:val="22"/>
-          <w:szCs w:val="22"/>
-        </w:rPr>
-        <w:t xml:space="preserve">02m - </w:t>
-      </w:r>
-      <w:r>
-        <w:rPr>
-          <w:rFonts w:ascii="Consolas" w:hAnsi="Consolas" w:cs="Consolas"/>
-          <w:sz w:val="22"/>
-          <w:szCs w:val="22"/>
-        </w:rPr>
-        <w:t>Adding clipper DSP</w:t>
-      </w:r>
-    </w:p>
-    <w:p>
-      <w:pPr>
-        <w:rPr>
-          <w:rFonts w:ascii="Consolas" w:hAnsi="Consolas" w:cs="Consolas"/>
-          <w:sz w:val="22"/>
-          <w:szCs w:val="22"/>
-        </w:rPr>
-      </w:pPr>
-    </w:p>
-    <w:p>
-      <w:pPr>
-        <w:rPr>
-          <w:rFonts w:ascii="Consolas" w:hAnsi="Consolas" w:cs="Consolas"/>
-          <w:sz w:val="22"/>
-          <w:szCs w:val="22"/>
-        </w:rPr>
-      </w:pPr>
-      <w:r>
-        <w:rPr>
-          <w:rFonts w:ascii="Consolas" w:hAnsi="Consolas" w:cs="Consolas"/>
-          <w:sz w:val="22"/>
-          <w:szCs w:val="22"/>
-        </w:rPr>
-        <w:t xml:space="preserve">02m </w:t>
-      </w:r>
-      <w:r>
-        <w:rPr>
-          <w:rFonts w:ascii="Consolas" w:hAnsi="Consolas" w:cs="Consolas"/>
-          <w:sz w:val="22"/>
-          <w:szCs w:val="22"/>
-        </w:rPr>
-        <w:t>–</w:t>
-      </w:r>
-      <w:r>
-        <w:rPr>
-          <w:rFonts w:ascii="Consolas" w:hAnsi="Consolas" w:cs="Consolas"/>
-          <w:sz w:val="22"/>
-          <w:szCs w:val="22"/>
-        </w:rPr>
-        <w:t xml:space="preserve"> </w:t>
-      </w:r>
-      <w:r>
-        <w:rPr>
-          <w:rFonts w:ascii="Consolas" w:hAnsi="Consolas" w:cs="Consolas"/>
-          <w:sz w:val="22"/>
-          <w:szCs w:val="22"/>
-        </w:rPr>
-        <w:t xml:space="preserve">Exporting and </w:t>
-      </w:r>
-      <w:r>
-        <w:rPr>
-          <w:rFonts w:ascii="Consolas" w:hAnsi="Consolas" w:cs="Consolas"/>
-          <w:sz w:val="22"/>
-          <w:szCs w:val="22"/>
-        </w:rPr>
-        <w:t>Tes</w:t>
-      </w:r>
-      <w:r>
-        <w:rPr>
-          <w:rFonts w:ascii="Consolas" w:hAnsi="Consolas" w:cs="Consolas"/>
-          <w:sz w:val="22"/>
-          <w:szCs w:val="22"/>
-        </w:rPr>
-        <w:t>ting</w:t>
-      </w:r>
-      <w:r>
-        <w:rPr>
-          <w:rFonts w:ascii="Consolas" w:hAnsi="Consolas" w:cs="Consolas"/>
-          <w:sz w:val="22"/>
-          <w:szCs w:val="22"/>
-        </w:rPr>
-        <w:t xml:space="preserve"> in Ableton</w:t>
-      </w:r>
-    </w:p>
-    <w:p>
-      <w:pPr>
+      </w:pPr>
+      <w:r>
+        <w:rPr>
+          <w:rFonts w:ascii="Consolas" w:hAnsi="Consolas" w:cs="Consolas"/>
+          <w:sz w:val="22"/>
+          <w:szCs w:val="22"/>
+        </w:rPr>
+        <w:tab/>
+      </w:r>
+      <w:r>
         <w:rPr>
           <w:rFonts w:ascii="Consolas" w:hAnsi="Consolas" w:cs="Consolas"/>
           <w:sz w:val="20"/>
           <w:szCs w:val="20"/>
         </w:rPr>
-      </w:pPr>
+        <w:t xml:space="preserve">For the simplest way to get all of the resources for the course, click “Code” and Download ZIP. This will download all of the files as a ZIP folder. If you want to be able to update your files whenever I make changes, you can clone it with Git. To install git, go to the Git website, download and install it. Then navigate to the folder where you want to save all of the course materials. Open this location in Terminal. Go to the </w:t>
+      </w:r>
+      <w:proofErr w:type="spellStart"/>
+      <w:proofErr w:type="gramStart"/>
       <w:r>
         <w:rPr>
           <w:rFonts w:ascii="Consolas" w:hAnsi="Consolas" w:cs="Consolas"/>
           <w:sz w:val="20"/>
           <w:szCs w:val="20"/>
         </w:rPr>
+        <w:t>Github</w:t>
+      </w:r>
+      <w:proofErr w:type="spellEnd"/>
+      <w:r>
+        <w:rPr>
+          <w:rFonts w:ascii="Consolas" w:hAnsi="Consolas" w:cs="Consolas"/>
+          <w:sz w:val="20"/>
+          <w:szCs w:val="20"/>
+        </w:rPr>
+        <w:t>, and</w:t>
+      </w:r>
+      <w:proofErr w:type="gramEnd"/>
+      <w:r>
+        <w:rPr>
+          <w:rFonts w:ascii="Consolas" w:hAnsi="Consolas" w:cs="Consolas"/>
+          <w:sz w:val="20"/>
+          <w:szCs w:val="20"/>
+        </w:rPr>
+        <w:t xml:space="preserve"> copy the HTTPS link from the Code button. In terminal, run ‘git clone &lt;link&gt;’. This will download all of the files to this location. To update your files with any updates I’ve made, open the location in terminal again and run ‘git pull’. That way you can keep </w:t>
+      </w:r>
+      <w:proofErr w:type="gramStart"/>
+      <w:r>
+        <w:rPr>
+          <w:rFonts w:ascii="Consolas" w:hAnsi="Consolas" w:cs="Consolas"/>
+          <w:sz w:val="20"/>
+          <w:szCs w:val="20"/>
+        </w:rPr>
+        <w:t>up-to-date</w:t>
+      </w:r>
+      <w:proofErr w:type="gramEnd"/>
+      <w:r>
+        <w:rPr>
+          <w:rFonts w:ascii="Consolas" w:hAnsi="Consolas" w:cs="Consolas"/>
+          <w:sz w:val="20"/>
+          <w:szCs w:val="20"/>
+        </w:rPr>
+        <w:t xml:space="preserve"> with any changes or additions I make to the course!</w:t>
+      </w:r>
+    </w:p>
+    <w:p>
+      <w:pPr>
+        <w:rPr>
+          <w:rFonts w:ascii="Consolas" w:hAnsi="Consolas" w:cs="Consolas"/>
+          <w:sz w:val="22"/>
+          <w:szCs w:val="22"/>
+        </w:rPr>
+      </w:pPr>
+      <w:r>
+        <w:rPr>
+          <w:rFonts w:ascii="Consolas" w:hAnsi="Consolas" w:cs="Consolas"/>
+          <w:sz w:val="22"/>
+          <w:szCs w:val="22"/>
+        </w:rPr>
+        <w:t xml:space="preserve">02m - </w:t>
+      </w:r>
+      <w:r>
+        <w:rPr>
+          <w:rFonts w:ascii="Consolas" w:hAnsi="Consolas" w:cs="Consolas"/>
+          <w:sz w:val="22"/>
+          <w:szCs w:val="22"/>
+        </w:rPr>
+        <w:t xml:space="preserve">Downloading </w:t>
+      </w:r>
+      <w:proofErr w:type="spellStart"/>
+      <w:r>
+        <w:rPr>
+          <w:rFonts w:ascii="Consolas" w:hAnsi="Consolas" w:cs="Consolas"/>
+          <w:sz w:val="22"/>
+          <w:szCs w:val="22"/>
+        </w:rPr>
+        <w:t>Projucer</w:t>
+      </w:r>
+      <w:proofErr w:type="spellEnd"/>
+    </w:p>
+    <w:p>
+      <w:pPr>
+        <w:ind w:firstLine="720"/>
+        <w:rPr>
+          <w:rFonts w:ascii="Consolas" w:hAnsi="Consolas" w:cs="Consolas"/>
+          <w:sz w:val="20"/>
+          <w:szCs w:val="20"/>
+        </w:rPr>
+      </w:pPr>
+      <w:r>
+        <w:rPr>
+          <w:rFonts w:ascii="Consolas" w:hAnsi="Consolas" w:cs="Consolas"/>
+          <w:sz w:val="20"/>
+          <w:szCs w:val="20"/>
+        </w:rPr>
+        <w:t>juce.com. “GET JUCE” (top right). “Download” on STARTER. Clone from GitHub as an option, recommend choosing version to download. Extract zip file, and place in Applications, or wherever you are likely to remember it. Double click “</w:t>
+      </w:r>
+      <w:proofErr w:type="spellStart"/>
+      <w:r>
+        <w:rPr>
+          <w:rFonts w:ascii="Consolas" w:hAnsi="Consolas" w:cs="Consolas"/>
+          <w:sz w:val="20"/>
+          <w:szCs w:val="20"/>
+        </w:rPr>
+        <w:t>Projucer</w:t>
+      </w:r>
+      <w:proofErr w:type="spellEnd"/>
+      <w:r>
+        <w:rPr>
+          <w:rFonts w:ascii="Consolas" w:hAnsi="Consolas" w:cs="Consolas"/>
+          <w:sz w:val="20"/>
+          <w:szCs w:val="20"/>
+        </w:rPr>
+        <w:t>” app. If it pops up with a warning that the app downloaded from the internet, press Open anyway.</w:t>
+      </w:r>
+    </w:p>
+    <w:p>
+      <w:pPr>
+        <w:rPr>
+          <w:rFonts w:ascii="Consolas" w:hAnsi="Consolas" w:cs="Consolas"/>
+          <w:sz w:val="22"/>
+          <w:szCs w:val="22"/>
+        </w:rPr>
+      </w:pPr>
+      <w:r>
+        <w:rPr>
+          <w:rFonts w:ascii="Consolas" w:hAnsi="Consolas" w:cs="Consolas"/>
+          <w:sz w:val="22"/>
+          <w:szCs w:val="22"/>
+        </w:rPr>
+        <w:t xml:space="preserve">01m - </w:t>
+      </w:r>
+      <w:r>
+        <w:rPr>
+          <w:rFonts w:ascii="Consolas" w:hAnsi="Consolas" w:cs="Consolas"/>
+          <w:sz w:val="22"/>
+          <w:szCs w:val="22"/>
+        </w:rPr>
+        <w:t>Creating a new project</w:t>
+      </w:r>
+    </w:p>
+    <w:p>
+      <w:pPr>
+        <w:rPr>
+          <w:rFonts w:ascii="Consolas" w:hAnsi="Consolas" w:cs="Consolas"/>
+          <w:sz w:val="22"/>
+          <w:szCs w:val="22"/>
+        </w:rPr>
+      </w:pPr>
+      <w:r>
+        <w:rPr>
+          <w:rFonts w:ascii="Consolas" w:hAnsi="Consolas" w:cs="Consolas"/>
+          <w:sz w:val="22"/>
+          <w:szCs w:val="22"/>
+        </w:rPr>
+        <w:tab/>
+      </w:r>
+      <w:r>
+        <w:rPr>
+          <w:rFonts w:ascii="Consolas" w:hAnsi="Consolas" w:cs="Consolas"/>
+          <w:sz w:val="20"/>
+          <w:szCs w:val="20"/>
+        </w:rPr>
+        <w:t>Default opens to New Project screen. In future, go to “File-&gt;New Project.” Choose “Plugin-&gt;Basic.” Add your plugin’s name in Project Name. Should have no spaces. Recommend leaving all modules as they are. Choose Xcode as exporter if on Mac, Visual Studio if on Windows. Press “Create Project.”</w:t>
+      </w:r>
+    </w:p>
+    <w:p>
+      <w:pPr>
+        <w:rPr>
+          <w:rFonts w:ascii="Consolas" w:hAnsi="Consolas" w:cs="Consolas"/>
+          <w:sz w:val="22"/>
+          <w:szCs w:val="22"/>
+        </w:rPr>
+      </w:pPr>
+      <w:r>
+        <w:rPr>
+          <w:rFonts w:ascii="Consolas" w:hAnsi="Consolas" w:cs="Consolas"/>
+          <w:sz w:val="22"/>
+          <w:szCs w:val="22"/>
+        </w:rPr>
+        <w:t xml:space="preserve">03m - </w:t>
+      </w:r>
+      <w:r>
+        <w:rPr>
+          <w:rFonts w:ascii="Consolas" w:hAnsi="Consolas" w:cs="Consolas"/>
+          <w:sz w:val="22"/>
+          <w:szCs w:val="22"/>
+        </w:rPr>
+        <w:t>Copying the template</w:t>
+      </w:r>
+    </w:p>
+    <w:p>
+      <w:pPr>
+        <w:rPr>
+          <w:rFonts w:ascii="Consolas" w:hAnsi="Consolas" w:cs="Consolas"/>
+          <w:sz w:val="22"/>
+          <w:szCs w:val="22"/>
+        </w:rPr>
+      </w:pPr>
+    </w:p>
+    <w:p>
+      <w:pPr>
+        <w:rPr>
+          <w:rFonts w:ascii="Consolas" w:hAnsi="Consolas" w:cs="Consolas"/>
+          <w:sz w:val="22"/>
+          <w:szCs w:val="22"/>
+        </w:rPr>
+      </w:pPr>
+      <w:r>
+        <w:rPr>
+          <w:rFonts w:ascii="Consolas" w:hAnsi="Consolas" w:cs="Consolas"/>
+          <w:sz w:val="22"/>
+          <w:szCs w:val="22"/>
+        </w:rPr>
+        <w:t xml:space="preserve">02m - </w:t>
+      </w:r>
+      <w:r>
+        <w:rPr>
+          <w:rFonts w:ascii="Consolas" w:hAnsi="Consolas" w:cs="Consolas"/>
+          <w:sz w:val="22"/>
+          <w:szCs w:val="22"/>
+        </w:rPr>
+        <w:t>Adding clipper DSP</w:t>
+      </w:r>
+    </w:p>
+    <w:p>
+      <w:pPr>
+        <w:rPr>
+          <w:rFonts w:ascii="Consolas" w:hAnsi="Consolas" w:cs="Consolas"/>
+          <w:sz w:val="22"/>
+          <w:szCs w:val="22"/>
+        </w:rPr>
+      </w:pPr>
+    </w:p>
+    <w:p>
+      <w:pPr>
+        <w:rPr>
+          <w:rFonts w:ascii="Consolas" w:hAnsi="Consolas" w:cs="Consolas"/>
+          <w:sz w:val="22"/>
+          <w:szCs w:val="22"/>
+        </w:rPr>
+      </w:pPr>
+      <w:r>
+        <w:rPr>
+          <w:rFonts w:ascii="Consolas" w:hAnsi="Consolas" w:cs="Consolas"/>
+          <w:sz w:val="22"/>
+          <w:szCs w:val="22"/>
+        </w:rPr>
+        <w:t xml:space="preserve">02m </w:t>
+      </w:r>
+      <w:r>
+        <w:rPr>
+          <w:rFonts w:ascii="Consolas" w:hAnsi="Consolas" w:cs="Consolas"/>
+          <w:sz w:val="22"/>
+          <w:szCs w:val="22"/>
+        </w:rPr>
+        <w:t>–</w:t>
+      </w:r>
+      <w:r>
+        <w:rPr>
+          <w:rFonts w:ascii="Consolas" w:hAnsi="Consolas" w:cs="Consolas"/>
+          <w:sz w:val="22"/>
+          <w:szCs w:val="22"/>
+        </w:rPr>
+        <w:t xml:space="preserve"> </w:t>
+      </w:r>
+      <w:r>
+        <w:rPr>
+          <w:rFonts w:ascii="Consolas" w:hAnsi="Consolas" w:cs="Consolas"/>
+          <w:sz w:val="22"/>
+          <w:szCs w:val="22"/>
+        </w:rPr>
+        <w:t xml:space="preserve">Exporting and </w:t>
+      </w:r>
+      <w:r>
+        <w:rPr>
+          <w:rFonts w:ascii="Consolas" w:hAnsi="Consolas" w:cs="Consolas"/>
+          <w:sz w:val="22"/>
+          <w:szCs w:val="22"/>
+        </w:rPr>
+        <w:t>Tes</w:t>
+      </w:r>
+      <w:r>
+        <w:rPr>
+          <w:rFonts w:ascii="Consolas" w:hAnsi="Consolas" w:cs="Consolas"/>
+          <w:sz w:val="22"/>
+          <w:szCs w:val="22"/>
+        </w:rPr>
+        <w:t>ting</w:t>
+      </w:r>
+      <w:r>
+        <w:rPr>
+          <w:rFonts w:ascii="Consolas" w:hAnsi="Consolas" w:cs="Consolas"/>
+          <w:sz w:val="22"/>
+          <w:szCs w:val="22"/>
+        </w:rPr>
+        <w:t xml:space="preserve"> in Ableton</w:t>
+      </w:r>
+    </w:p>
+    <w:p>
+      <w:pPr>
+        <w:rPr>
+          <w:rFonts w:ascii="Consolas" w:hAnsi="Consolas" w:cs="Consolas"/>
+          <w:sz w:val="20"/>
+          <w:szCs w:val="20"/>
+        </w:rPr>
+      </w:pPr>
+      <w:r>
+        <w:rPr>
+          <w:rFonts w:ascii="Consolas" w:hAnsi="Consolas" w:cs="Consolas"/>
+          <w:sz w:val="20"/>
+          <w:szCs w:val="20"/>
+        </w:rPr>
         <w:tab/>
         <w:t xml:space="preserve">Close Xcode and go back to </w:t>
       </w:r>
@@ -509,7 +595,6 @@
           <w:sz w:val="20"/>
           <w:szCs w:val="20"/>
         </w:rPr>
-        <w:lastRenderedPageBreak/>
         <w:tab/>
         <w:t>Re-open Xcode, choose build target, and run. Show export locations. Open Ableton, auto-rescan plugins. Search for plugin. Test.</w:t>
       </w:r>

</xml_diff>

<commit_message>
added a few more ideas to semester 2
</commit_message>
<xml_diff>
--- a/Scripts/Outlines.docx
+++ b/Scripts/Outlines.docx
@@ -20,123 +20,84 @@
           <w:sz w:val="32"/>
           <w:szCs w:val="32"/>
         </w:rPr>
-        <w:t>E01 – Introduction</w:t>
-      </w:r>
-      <w:r>
-        <w:rPr>
-          <w:rFonts w:ascii="Consolas" w:hAnsi="Consolas" w:cs="Consolas"/>
-          <w:b/>
-          <w:bCs/>
-          <w:sz w:val="32"/>
-          <w:szCs w:val="32"/>
-        </w:rPr>
-        <w:t>: Your First Plugin</w:t>
-      </w:r>
-    </w:p>
-    <w:p>
-      <w:pPr>
-        <w:rPr>
-          <w:rFonts w:ascii="Consolas" w:hAnsi="Consolas" w:cs="Consolas"/>
-          <w:sz w:val="22"/>
-          <w:szCs w:val="22"/>
-        </w:rPr>
-      </w:pPr>
-      <w:r>
-        <w:rPr>
-          <w:rFonts w:ascii="Consolas" w:hAnsi="Consolas" w:cs="Consolas"/>
-          <w:sz w:val="22"/>
-          <w:szCs w:val="22"/>
-        </w:rPr>
-        <w:t>Using the Templ</w:t>
-      </w:r>
-      <w:r>
-        <w:rPr>
-          <w:rFonts w:ascii="Consolas" w:hAnsi="Consolas" w:cs="Consolas"/>
-          <w:sz w:val="22"/>
-          <w:szCs w:val="22"/>
-        </w:rPr>
-        <w:t xml:space="preserve">ate, </w:t>
-      </w:r>
-      <w:proofErr w:type="gramStart"/>
-      <w:r>
-        <w:rPr>
-          <w:rFonts w:ascii="Consolas" w:hAnsi="Consolas" w:cs="Consolas"/>
-          <w:sz w:val="22"/>
-          <w:szCs w:val="22"/>
-        </w:rPr>
-        <w:t>Making</w:t>
-      </w:r>
-      <w:proofErr w:type="gramEnd"/>
-      <w:r>
-        <w:rPr>
-          <w:rFonts w:ascii="Consolas" w:hAnsi="Consolas" w:cs="Consolas"/>
-          <w:sz w:val="22"/>
-          <w:szCs w:val="22"/>
-        </w:rPr>
-        <w:t xml:space="preserve"> a Hard Clipper, Adding Parameters</w:t>
-      </w:r>
-    </w:p>
-    <w:p>
-      <w:pPr>
-        <w:rPr>
-          <w:rFonts w:ascii="Consolas" w:hAnsi="Consolas" w:cs="Consolas"/>
-          <w:sz w:val="32"/>
-          <w:szCs w:val="32"/>
-        </w:rPr>
-      </w:pPr>
-    </w:p>
-    <w:p>
-      <w:pPr>
-        <w:rPr>
-          <w:rFonts w:ascii="Consolas" w:hAnsi="Consolas" w:cs="Consolas"/>
-          <w:sz w:val="22"/>
-          <w:szCs w:val="22"/>
-        </w:rPr>
-      </w:pPr>
-      <w:r>
-        <w:rPr>
-          <w:rFonts w:ascii="Consolas" w:hAnsi="Consolas" w:cs="Consolas"/>
-          <w:sz w:val="22"/>
-          <w:szCs w:val="22"/>
-        </w:rPr>
-        <w:t>(1</w:t>
-      </w:r>
-      <w:r>
-        <w:rPr>
-          <w:rFonts w:ascii="Consolas" w:hAnsi="Consolas" w:cs="Consolas"/>
-          <w:sz w:val="22"/>
-          <w:szCs w:val="22"/>
-        </w:rPr>
-        <w:t>7</w:t>
-      </w:r>
-      <w:r>
-        <w:rPr>
-          <w:rFonts w:ascii="Consolas" w:hAnsi="Consolas" w:cs="Consolas"/>
-          <w:sz w:val="22"/>
-          <w:szCs w:val="22"/>
-        </w:rPr>
-        <w:t>.5 Minutes)</w:t>
-      </w:r>
-    </w:p>
-    <w:p>
-      <w:pPr>
-        <w:rPr>
-          <w:rFonts w:ascii="Consolas" w:hAnsi="Consolas" w:cs="Consolas"/>
-          <w:sz w:val="22"/>
-          <w:szCs w:val="22"/>
-        </w:rPr>
-      </w:pPr>
-      <w:r>
-        <w:rPr>
-          <w:rFonts w:ascii="Consolas" w:hAnsi="Consolas" w:cs="Consolas"/>
-          <w:sz w:val="22"/>
-          <w:szCs w:val="22"/>
-        </w:rPr>
-        <w:t>30s - Cold Open</w:t>
-      </w:r>
-    </w:p>
-    <w:p>
-      <w:pPr>
+        <w:t>E0</w:t>
+      </w:r>
+      <w:r>
+        <w:rPr>
+          <w:rFonts w:ascii="Consolas" w:hAnsi="Consolas" w:cs="Consolas"/>
+          <w:b/>
+          <w:bCs/>
+          <w:sz w:val="32"/>
+          <w:szCs w:val="32"/>
+        </w:rPr>
+        <w:t>0</w:t>
+      </w:r>
+      <w:r>
+        <w:rPr>
+          <w:rFonts w:ascii="Consolas" w:hAnsi="Consolas" w:cs="Consolas"/>
+          <w:b/>
+          <w:bCs/>
+          <w:sz w:val="32"/>
+          <w:szCs w:val="32"/>
+        </w:rPr>
+        <w:t xml:space="preserve"> – </w:t>
+      </w:r>
+      <w:r>
+        <w:rPr>
+          <w:rFonts w:ascii="Consolas" w:hAnsi="Consolas" w:cs="Consolas"/>
+          <w:b/>
+          <w:bCs/>
+          <w:sz w:val="32"/>
+          <w:szCs w:val="32"/>
+        </w:rPr>
+        <w:t>Course Overview</w:t>
+      </w:r>
+    </w:p>
+    <w:p>
+      <w:pPr>
+        <w:rPr>
+          <w:rFonts w:ascii="Consolas" w:hAnsi="Consolas" w:cs="Consolas"/>
+          <w:sz w:val="22"/>
+          <w:szCs w:val="22"/>
+        </w:rPr>
+      </w:pPr>
+      <w:r>
+        <w:rPr>
+          <w:rFonts w:ascii="Consolas" w:hAnsi="Consolas" w:cs="Consolas"/>
+          <w:sz w:val="22"/>
+          <w:szCs w:val="22"/>
+        </w:rPr>
+        <w:t>(5</w:t>
+      </w:r>
+      <w:r>
+        <w:rPr>
+          <w:rFonts w:ascii="Consolas" w:hAnsi="Consolas" w:cs="Consolas"/>
+          <w:sz w:val="22"/>
+          <w:szCs w:val="22"/>
+        </w:rPr>
+        <w:t xml:space="preserve"> Minutes)</w:t>
+      </w:r>
+    </w:p>
+    <w:p>
+      <w:pPr>
+        <w:rPr>
+          <w:rFonts w:ascii="Consolas" w:hAnsi="Consolas" w:cs="Consolas"/>
+          <w:sz w:val="22"/>
+          <w:szCs w:val="22"/>
+        </w:rPr>
+      </w:pPr>
+      <w:r>
+        <w:rPr>
+          <w:rFonts w:ascii="Consolas" w:hAnsi="Consolas" w:cs="Consolas"/>
+          <w:sz w:val="22"/>
+          <w:szCs w:val="22"/>
+        </w:rPr>
+        <w:t>Talking Head</w:t>
+      </w:r>
+    </w:p>
+    <w:p>
+      <w:pPr>
+        <w:ind w:firstLine="720"/>
         <w:rPr>
           <w:rFonts w:ascii="Consolas" w:hAnsi="Consolas" w:cs="Consolas"/>
           <w:sz w:val="20"/>
@@ -146,149 +107,531 @@
       <w:r>
         <w:rPr>
           <w:rFonts w:ascii="Consolas" w:hAnsi="Consolas" w:cs="Consolas"/>
-          <w:sz w:val="22"/>
-          <w:szCs w:val="22"/>
-        </w:rPr>
-        <w:tab/>
-      </w:r>
-      <w:r>
-        <w:rPr>
-          <w:rFonts w:ascii="Consolas" w:hAnsi="Consolas" w:cs="Consolas"/>
           <w:sz w:val="20"/>
           <w:szCs w:val="20"/>
         </w:rPr>
-        <w:t>In this course, you will learn how to get started making your own real-time audio plugins! For the purpose of ease, we will be using the JUCE framework, but the course has been designed to teach concepts in a way that can be transferred to any platform. By the end of the first semester, which covers twelve episodes and culminates in a midterm project, you will have enough knowledge to create a basic synthesizer with a small collection of effects!</w:t>
-      </w:r>
-    </w:p>
-    <w:p>
-      <w:pPr>
-        <w:ind w:firstLine="720"/>
+        <w:t>Hello! Welcome to Intro to Plugin Development. My name is Nico Russo. I am a student at the University of Miami’s Frost School of Music studying Music Engineering Technology, with minors in both Computer Engineering and Computer Science. I’ve dedicated the last five years to learning and experimenting with plugin development, and I</w:t>
+      </w:r>
+      <w:r>
         <w:rPr>
           <w:rFonts w:ascii="Consolas" w:hAnsi="Consolas" w:cs="Consolas"/>
           <w:sz w:val="20"/>
           <w:szCs w:val="20"/>
         </w:rPr>
-      </w:pPr>
+        <w:t>’ve</w:t>
+      </w:r>
       <w:r>
         <w:rPr>
           <w:rFonts w:ascii="Consolas" w:hAnsi="Consolas" w:cs="Consolas"/>
           <w:sz w:val="20"/>
           <w:szCs w:val="20"/>
         </w:rPr>
-        <w:t>The course expects you are familiar with basic C++ syntax and concepts before beginning, but no digital signal processing knowledge is needed in advance.</w:t>
-      </w:r>
-    </w:p>
-    <w:p>
-      <w:pPr>
-        <w:rPr>
-          <w:rFonts w:ascii="Consolas" w:hAnsi="Consolas" w:cs="Consolas"/>
-          <w:sz w:val="22"/>
-          <w:szCs w:val="22"/>
-        </w:rPr>
-      </w:pPr>
-      <w:r>
-        <w:rPr>
-          <w:rFonts w:ascii="Consolas" w:hAnsi="Consolas" w:cs="Consolas"/>
-          <w:sz w:val="22"/>
-          <w:szCs w:val="22"/>
-        </w:rPr>
-        <w:t>05s - Title Card</w:t>
-      </w:r>
-    </w:p>
-    <w:p>
-      <w:pPr>
-        <w:rPr>
-          <w:rFonts w:ascii="Consolas" w:hAnsi="Consolas" w:cs="Consolas"/>
-          <w:sz w:val="22"/>
-          <w:szCs w:val="22"/>
-        </w:rPr>
-      </w:pPr>
-      <w:r>
-        <w:rPr>
-          <w:rFonts w:ascii="Consolas" w:hAnsi="Consolas" w:cs="Consolas"/>
-          <w:sz w:val="22"/>
-          <w:szCs w:val="22"/>
-        </w:rPr>
-        <w:t xml:space="preserve">02m - </w:t>
-      </w:r>
-      <w:r>
-        <w:rPr>
-          <w:rFonts w:ascii="Consolas" w:hAnsi="Consolas" w:cs="Consolas"/>
-          <w:sz w:val="22"/>
-          <w:szCs w:val="22"/>
-        </w:rPr>
-        <w:t>Cloning the repo</w:t>
-      </w:r>
-    </w:p>
-    <w:p>
-      <w:pPr>
+        <w:t xml:space="preserve"> made this course to share what I have learned and to hopefully get more people over the initial hurdles that come </w:t>
+      </w:r>
+      <w:r>
         <w:rPr>
           <w:rFonts w:ascii="Consolas" w:hAnsi="Consolas" w:cs="Consolas"/>
           <w:sz w:val="20"/>
           <w:szCs w:val="20"/>
-        </w:rPr>
-      </w:pPr>
-      <w:r>
-        <w:rPr>
-          <w:rFonts w:ascii="Consolas" w:hAnsi="Consolas" w:cs="Consolas"/>
-          <w:sz w:val="22"/>
-          <w:szCs w:val="22"/>
-        </w:rPr>
-        <w:tab/>
+          <w:highlight w:val="yellow"/>
+        </w:rPr>
+        <w:t>with learning</w:t>
       </w:r>
       <w:r>
         <w:rPr>
           <w:rFonts w:ascii="Consolas" w:hAnsi="Consolas" w:cs="Consolas"/>
           <w:sz w:val="20"/>
           <w:szCs w:val="20"/>
-        </w:rPr>
-        <w:t xml:space="preserve">For the simplest way to get all of the resources for the course, click “Code” and Download ZIP. This will download all of the files as a ZIP folder. If you want to be able to update your files whenever I make changes, you can clone it with Git. To install git, go to the Git website, download and install it. Then navigate to the folder where you want to save all of the course materials. Open this location in Terminal. Go to the </w:t>
-      </w:r>
-      <w:proofErr w:type="spellStart"/>
-      <w:proofErr w:type="gramStart"/>
+          <w:highlight w:val="yellow"/>
+        </w:rPr>
+        <w:t xml:space="preserve"> this topic</w:t>
+      </w:r>
       <w:r>
         <w:rPr>
           <w:rFonts w:ascii="Consolas" w:hAnsi="Consolas" w:cs="Consolas"/>
           <w:sz w:val="20"/>
           <w:szCs w:val="20"/>
         </w:rPr>
-        <w:t>Github</w:t>
-      </w:r>
-      <w:proofErr w:type="spellEnd"/>
-      <w:r>
+        <w:t>.</w:t>
+      </w:r>
+    </w:p>
+    <w:p>
+      <w:pPr>
+        <w:ind w:firstLine="720"/>
         <w:rPr>
           <w:rFonts w:ascii="Consolas" w:hAnsi="Consolas" w:cs="Consolas"/>
           <w:sz w:val="20"/>
           <w:szCs w:val="20"/>
         </w:rPr>
-        <w:t>, and</w:t>
-      </w:r>
-      <w:proofErr w:type="gramEnd"/>
+      </w:pPr>
       <w:r>
         <w:rPr>
           <w:rFonts w:ascii="Consolas" w:hAnsi="Consolas" w:cs="Consolas"/>
           <w:sz w:val="20"/>
           <w:szCs w:val="20"/>
-        </w:rPr>
-        <w:t xml:space="preserve"> copy the HTTPS link from the Code button. In terminal, run ‘git clone &lt;link&gt;’. This will download all of the files to this location. To update your files with any updates I’ve made, open the location in terminal again and run ‘git pull’. That way you can keep </w:t>
-      </w:r>
-      <w:proofErr w:type="gramStart"/>
+          <w:highlight w:val="yellow"/>
+        </w:rPr>
+        <w:t>Somewhere in there, mention that I’ve been making music even longer and I’ve been working with audio plugins for that entire time. This led to me wishing there were certain plugins that didn’t exist which led me down this path.</w:t>
+      </w:r>
       <w:r>
         <w:rPr>
           <w:rFonts w:ascii="Consolas" w:hAnsi="Consolas" w:cs="Consolas"/>
           <w:sz w:val="20"/>
           <w:szCs w:val="20"/>
         </w:rPr>
-        <w:t>up-to-date</w:t>
-      </w:r>
-      <w:proofErr w:type="gramEnd"/>
-      <w:r>
+        <w:t xml:space="preserve"> </w:t>
+      </w:r>
+    </w:p>
+    <w:p>
+      <w:pPr>
+        <w:rPr>
+          <w:rFonts w:ascii="Consolas" w:hAnsi="Consolas" w:cs="Consolas"/>
+          <w:sz w:val="22"/>
+          <w:szCs w:val="22"/>
+        </w:rPr>
+      </w:pPr>
+      <w:r>
+        <w:rPr>
+          <w:rFonts w:ascii="Consolas" w:hAnsi="Consolas" w:cs="Consolas"/>
+          <w:sz w:val="22"/>
+          <w:szCs w:val="22"/>
+        </w:rPr>
+        <w:t>What is the course</w:t>
+      </w:r>
+    </w:p>
+    <w:p>
+      <w:pPr>
+        <w:ind w:firstLine="720"/>
         <w:rPr>
           <w:rFonts w:ascii="Consolas" w:hAnsi="Consolas" w:cs="Consolas"/>
           <w:sz w:val="20"/>
           <w:szCs w:val="20"/>
         </w:rPr>
-        <w:t xml:space="preserve"> with any changes or additions I make to the course!</w:t>
+      </w:pPr>
+      <w:r>
+        <w:rPr>
+          <w:rFonts w:ascii="Consolas" w:hAnsi="Consolas" w:cs="Consolas"/>
+          <w:sz w:val="20"/>
+          <w:szCs w:val="20"/>
+        </w:rPr>
+        <w:t xml:space="preserve">In this course, you will learn how to get started making your own real-time audio plugins! </w:t>
+      </w:r>
+      <w:r>
+        <w:rPr>
+          <w:rFonts w:ascii="Consolas" w:hAnsi="Consolas" w:cs="Consolas"/>
+          <w:sz w:val="20"/>
+          <w:szCs w:val="20"/>
+        </w:rPr>
+        <w:t>To make the development process more straightforward</w:t>
+      </w:r>
+      <w:r>
+        <w:rPr>
+          <w:rFonts w:ascii="Consolas" w:hAnsi="Consolas" w:cs="Consolas"/>
+          <w:sz w:val="20"/>
+          <w:szCs w:val="20"/>
+        </w:rPr>
+        <w:t>, we will be using the JUCE framework, but the course has been designed to teach concepts in a way that can be transferred to any platform.</w:t>
+      </w:r>
+    </w:p>
+    <w:p>
+      <w:pPr>
+        <w:rPr>
+          <w:rFonts w:ascii="Consolas" w:hAnsi="Consolas" w:cs="Consolas"/>
+          <w:sz w:val="20"/>
+          <w:szCs w:val="20"/>
+        </w:rPr>
+      </w:pPr>
+      <w:r>
+        <w:rPr>
+          <w:rFonts w:ascii="Consolas" w:hAnsi="Consolas" w:cs="Consolas"/>
+          <w:sz w:val="22"/>
+          <w:szCs w:val="22"/>
+        </w:rPr>
+        <w:t>Who is it for</w:t>
+      </w:r>
+    </w:p>
+    <w:p>
+      <w:pPr>
+        <w:ind w:firstLine="720"/>
+        <w:rPr>
+          <w:rFonts w:ascii="Consolas" w:hAnsi="Consolas" w:cs="Consolas"/>
+          <w:sz w:val="20"/>
+          <w:szCs w:val="20"/>
+        </w:rPr>
+      </w:pPr>
+      <w:r>
+        <w:rPr>
+          <w:rFonts w:ascii="Consolas" w:hAnsi="Consolas" w:cs="Consolas"/>
+          <w:sz w:val="20"/>
+          <w:szCs w:val="20"/>
+        </w:rPr>
+        <w:t xml:space="preserve">The course expects you </w:t>
+      </w:r>
+      <w:r>
+        <w:rPr>
+          <w:rFonts w:ascii="Consolas" w:hAnsi="Consolas" w:cs="Consolas"/>
+          <w:sz w:val="20"/>
+          <w:szCs w:val="20"/>
+        </w:rPr>
+        <w:t>to be</w:t>
+      </w:r>
+      <w:r>
+        <w:rPr>
+          <w:rFonts w:ascii="Consolas" w:hAnsi="Consolas" w:cs="Consolas"/>
+          <w:sz w:val="20"/>
+          <w:szCs w:val="20"/>
+        </w:rPr>
+        <w:t xml:space="preserve"> familiar with basic C++ syntax and concepts before beginning, but no digital signal processing knowledge is needed in advance.</w:t>
+      </w:r>
+    </w:p>
+    <w:p>
+      <w:pPr>
+        <w:rPr>
+          <w:rFonts w:ascii="Consolas" w:hAnsi="Consolas" w:cs="Consolas"/>
+          <w:sz w:val="22"/>
+          <w:szCs w:val="22"/>
+        </w:rPr>
+      </w:pPr>
+      <w:r>
+        <w:rPr>
+          <w:rFonts w:ascii="Consolas" w:hAnsi="Consolas" w:cs="Consolas"/>
+          <w:sz w:val="22"/>
+          <w:szCs w:val="22"/>
+        </w:rPr>
+        <w:t>What will you learn</w:t>
+      </w:r>
+    </w:p>
+    <w:p>
+      <w:pPr>
+        <w:ind w:firstLine="720"/>
+        <w:rPr>
+          <w:rFonts w:ascii="Consolas" w:hAnsi="Consolas" w:cs="Consolas"/>
+          <w:sz w:val="20"/>
+          <w:szCs w:val="20"/>
+        </w:rPr>
+      </w:pPr>
+      <w:r>
+        <w:rPr>
+          <w:rFonts w:ascii="Consolas" w:hAnsi="Consolas" w:cs="Consolas"/>
+          <w:sz w:val="20"/>
+          <w:szCs w:val="20"/>
+        </w:rPr>
+        <w:t xml:space="preserve">By the end of the first semester, which covers twelve episodes and culminates in a midterm project, you </w:t>
+      </w:r>
+      <w:r>
+        <w:rPr>
+          <w:rFonts w:ascii="Consolas" w:hAnsi="Consolas" w:cs="Consolas"/>
+          <w:sz w:val="20"/>
+          <w:szCs w:val="20"/>
+        </w:rPr>
+        <w:t>should</w:t>
+      </w:r>
+      <w:r>
+        <w:rPr>
+          <w:rFonts w:ascii="Consolas" w:hAnsi="Consolas" w:cs="Consolas"/>
+          <w:sz w:val="20"/>
+          <w:szCs w:val="20"/>
+        </w:rPr>
+        <w:t xml:space="preserve"> have enough knowledge to create a basic synthesizer with a small collection of effects</w:t>
+      </w:r>
+      <w:r>
+        <w:rPr>
+          <w:rFonts w:ascii="Consolas" w:hAnsi="Consolas" w:cs="Consolas"/>
+          <w:sz w:val="20"/>
+          <w:szCs w:val="20"/>
+        </w:rPr>
+        <w:t>!</w:t>
+      </w:r>
+    </w:p>
+    <w:p>
+      <w:pPr>
+        <w:rPr>
+          <w:rFonts w:ascii="Consolas" w:hAnsi="Consolas" w:cs="Consolas"/>
+          <w:sz w:val="22"/>
+          <w:szCs w:val="22"/>
+        </w:rPr>
+      </w:pPr>
+      <w:r>
+        <w:rPr>
+          <w:rFonts w:ascii="Consolas" w:hAnsi="Consolas" w:cs="Consolas"/>
+          <w:sz w:val="22"/>
+          <w:szCs w:val="22"/>
+        </w:rPr>
+        <w:t>Close</w:t>
+      </w:r>
+    </w:p>
+    <w:p>
+      <w:pPr>
+        <w:ind w:firstLine="720"/>
+        <w:rPr>
+          <w:rFonts w:ascii="Consolas" w:hAnsi="Consolas" w:cs="Consolas"/>
+          <w:sz w:val="20"/>
+          <w:szCs w:val="20"/>
+        </w:rPr>
+      </w:pPr>
+      <w:r>
+        <w:rPr>
+          <w:rFonts w:ascii="Consolas" w:hAnsi="Consolas" w:cs="Consolas"/>
+          <w:sz w:val="20"/>
+          <w:szCs w:val="20"/>
+        </w:rPr>
+        <w:t>Thank you for watching! Make sure to SMASH that like button and SUBSCRIBE for more EPIC DEVELEOPMNT.</w:t>
+      </w:r>
+    </w:p>
+    <w:p>
+      <w:pPr>
+        <w:rPr>
+          <w:rFonts w:ascii="Consolas" w:hAnsi="Consolas" w:cs="Consolas"/>
+          <w:sz w:val="20"/>
+          <w:szCs w:val="20"/>
+        </w:rPr>
+      </w:pPr>
+    </w:p>
+    <w:p>
+      <w:pPr>
+        <w:rPr>
+          <w:rFonts w:ascii="Consolas" w:hAnsi="Consolas" w:cs="Consolas"/>
+          <w:b/>
+          <w:bCs/>
+          <w:sz w:val="32"/>
+          <w:szCs w:val="32"/>
+        </w:rPr>
+      </w:pPr>
+      <w:r>
+        <w:rPr>
+          <w:rFonts w:ascii="Consolas" w:hAnsi="Consolas" w:cs="Consolas"/>
+          <w:b/>
+          <w:bCs/>
+          <w:sz w:val="32"/>
+          <w:szCs w:val="32"/>
+        </w:rPr>
+        <w:br w:type="page"/>
+      </w:r>
+    </w:p>
+    <w:p>
+      <w:pPr>
+        <w:rPr>
+          <w:rFonts w:ascii="Consolas" w:hAnsi="Consolas" w:cs="Consolas"/>
+          <w:b/>
+          <w:bCs/>
+          <w:sz w:val="32"/>
+          <w:szCs w:val="32"/>
+        </w:rPr>
+      </w:pPr>
+      <w:r>
+        <w:rPr>
+          <w:rFonts w:ascii="Consolas" w:hAnsi="Consolas" w:cs="Consolas"/>
+          <w:b/>
+          <w:bCs/>
+          <w:sz w:val="32"/>
+          <w:szCs w:val="32"/>
+        </w:rPr>
+        <w:lastRenderedPageBreak/>
+        <w:t>E01 – Introduction</w:t>
+      </w:r>
+      <w:r>
+        <w:rPr>
+          <w:rFonts w:ascii="Consolas" w:hAnsi="Consolas" w:cs="Consolas"/>
+          <w:b/>
+          <w:bCs/>
+          <w:sz w:val="32"/>
+          <w:szCs w:val="32"/>
+        </w:rPr>
+        <w:t>: Your First Plugin</w:t>
+      </w:r>
+    </w:p>
+    <w:p>
+      <w:pPr>
+        <w:rPr>
+          <w:rFonts w:ascii="Consolas" w:hAnsi="Consolas" w:cs="Consolas"/>
+          <w:sz w:val="22"/>
+          <w:szCs w:val="22"/>
+        </w:rPr>
+      </w:pPr>
+      <w:r>
+        <w:rPr>
+          <w:rFonts w:ascii="Consolas" w:hAnsi="Consolas" w:cs="Consolas"/>
+          <w:sz w:val="22"/>
+          <w:szCs w:val="22"/>
+        </w:rPr>
+        <w:t>Using the Templ</w:t>
+      </w:r>
+      <w:r>
+        <w:rPr>
+          <w:rFonts w:ascii="Consolas" w:hAnsi="Consolas" w:cs="Consolas"/>
+          <w:sz w:val="22"/>
+          <w:szCs w:val="22"/>
+        </w:rPr>
+        <w:t xml:space="preserve">ate, </w:t>
+      </w:r>
+      <w:proofErr w:type="gramStart"/>
+      <w:r>
+        <w:rPr>
+          <w:rFonts w:ascii="Consolas" w:hAnsi="Consolas" w:cs="Consolas"/>
+          <w:sz w:val="22"/>
+          <w:szCs w:val="22"/>
+        </w:rPr>
+        <w:t>Making</w:t>
+      </w:r>
+      <w:proofErr w:type="gramEnd"/>
+      <w:r>
+        <w:rPr>
+          <w:rFonts w:ascii="Consolas" w:hAnsi="Consolas" w:cs="Consolas"/>
+          <w:sz w:val="22"/>
+          <w:szCs w:val="22"/>
+        </w:rPr>
+        <w:t xml:space="preserve"> a Hard Clipper, Adding Parameters</w:t>
+      </w:r>
+    </w:p>
+    <w:p>
+      <w:pPr>
+        <w:rPr>
+          <w:rFonts w:ascii="Consolas" w:hAnsi="Consolas" w:cs="Consolas"/>
+          <w:sz w:val="32"/>
+          <w:szCs w:val="32"/>
+        </w:rPr>
+      </w:pPr>
+    </w:p>
+    <w:p>
+      <w:pPr>
+        <w:rPr>
+          <w:rFonts w:ascii="Consolas" w:hAnsi="Consolas" w:cs="Consolas"/>
+          <w:sz w:val="22"/>
+          <w:szCs w:val="22"/>
+        </w:rPr>
+      </w:pPr>
+      <w:r>
+        <w:rPr>
+          <w:rFonts w:ascii="Consolas" w:hAnsi="Consolas" w:cs="Consolas"/>
+          <w:sz w:val="22"/>
+          <w:szCs w:val="22"/>
+        </w:rPr>
+        <w:t>(1</w:t>
+      </w:r>
+      <w:r>
+        <w:rPr>
+          <w:rFonts w:ascii="Consolas" w:hAnsi="Consolas" w:cs="Consolas"/>
+          <w:sz w:val="22"/>
+          <w:szCs w:val="22"/>
+        </w:rPr>
+        <w:t>7</w:t>
+      </w:r>
+      <w:r>
+        <w:rPr>
+          <w:rFonts w:ascii="Consolas" w:hAnsi="Consolas" w:cs="Consolas"/>
+          <w:sz w:val="22"/>
+          <w:szCs w:val="22"/>
+        </w:rPr>
+        <w:t>.5 Minutes)</w:t>
+      </w:r>
+    </w:p>
+    <w:p>
+      <w:pPr>
+        <w:rPr>
+          <w:rFonts w:ascii="Consolas" w:hAnsi="Consolas" w:cs="Consolas"/>
+          <w:sz w:val="22"/>
+          <w:szCs w:val="22"/>
+        </w:rPr>
+      </w:pPr>
+      <w:r>
+        <w:rPr>
+          <w:rFonts w:ascii="Consolas" w:hAnsi="Consolas" w:cs="Consolas"/>
+          <w:sz w:val="22"/>
+          <w:szCs w:val="22"/>
+        </w:rPr>
+        <w:t>5</w:t>
+      </w:r>
+      <w:r>
+        <w:rPr>
+          <w:rFonts w:ascii="Consolas" w:hAnsi="Consolas" w:cs="Consolas"/>
+          <w:sz w:val="22"/>
+          <w:szCs w:val="22"/>
+        </w:rPr>
+        <w:t>s - Cold Open</w:t>
+      </w:r>
+    </w:p>
+    <w:p>
+      <w:pPr>
+        <w:rPr>
+          <w:rFonts w:ascii="Consolas" w:hAnsi="Consolas" w:cs="Consolas"/>
+          <w:sz w:val="20"/>
+          <w:szCs w:val="20"/>
+        </w:rPr>
+      </w:pPr>
+      <w:r>
+        <w:rPr>
+          <w:rFonts w:ascii="Consolas" w:hAnsi="Consolas" w:cs="Consolas"/>
+          <w:sz w:val="22"/>
+          <w:szCs w:val="22"/>
+        </w:rPr>
+        <w:tab/>
+      </w:r>
+    </w:p>
+    <w:p>
+      <w:pPr>
+        <w:rPr>
+          <w:rFonts w:ascii="Consolas" w:hAnsi="Consolas" w:cs="Consolas"/>
+          <w:sz w:val="22"/>
+          <w:szCs w:val="22"/>
+        </w:rPr>
+      </w:pPr>
+      <w:r>
+        <w:rPr>
+          <w:rFonts w:ascii="Consolas" w:hAnsi="Consolas" w:cs="Consolas"/>
+          <w:sz w:val="22"/>
+          <w:szCs w:val="22"/>
+        </w:rPr>
+        <w:t>05s - Title Card</w:t>
+      </w:r>
+    </w:p>
+    <w:p>
+      <w:pPr>
+        <w:rPr>
+          <w:rFonts w:ascii="Consolas" w:hAnsi="Consolas" w:cs="Consolas"/>
+          <w:sz w:val="22"/>
+          <w:szCs w:val="22"/>
+        </w:rPr>
+      </w:pPr>
+      <w:r>
+        <w:rPr>
+          <w:rFonts w:ascii="Consolas" w:hAnsi="Consolas" w:cs="Consolas"/>
+          <w:sz w:val="22"/>
+          <w:szCs w:val="22"/>
+        </w:rPr>
+        <w:t xml:space="preserve">02m - </w:t>
+      </w:r>
+      <w:r>
+        <w:rPr>
+          <w:rFonts w:ascii="Consolas" w:hAnsi="Consolas" w:cs="Consolas"/>
+          <w:sz w:val="22"/>
+          <w:szCs w:val="22"/>
+        </w:rPr>
+        <w:t>Cloning the repo</w:t>
+      </w:r>
+    </w:p>
+    <w:p>
+      <w:pPr>
+        <w:rPr>
+          <w:rFonts w:ascii="Consolas" w:hAnsi="Consolas" w:cs="Consolas"/>
+          <w:sz w:val="20"/>
+          <w:szCs w:val="20"/>
+        </w:rPr>
+      </w:pPr>
+      <w:r>
+        <w:rPr>
+          <w:rFonts w:ascii="Consolas" w:hAnsi="Consolas" w:cs="Consolas"/>
+          <w:sz w:val="22"/>
+          <w:szCs w:val="22"/>
+        </w:rPr>
+        <w:tab/>
+      </w:r>
+      <w:r>
+        <w:rPr>
+          <w:rFonts w:ascii="Consolas" w:hAnsi="Consolas" w:cs="Consolas"/>
+          <w:sz w:val="20"/>
+          <w:szCs w:val="20"/>
+        </w:rPr>
+        <w:t>For the simplest way to get all of the resources for the course, click “Code” and Download ZIP. This will download all of the files as a ZIP folder.</w:t>
       </w:r>
     </w:p>
     <w:p>

</xml_diff>

<commit_message>
rewrote biquad in direct form
</commit_message>
<xml_diff>
--- a/Scripts/Outlines.docx
+++ b/Scripts/Outlines.docx
@@ -67,15 +67,7 @@
           <w:sz w:val="22"/>
           <w:szCs w:val="22"/>
         </w:rPr>
-        <w:t>(5</w:t>
-      </w:r>
-      <w:r>
-        <w:rPr>
-          <w:rFonts w:ascii="Consolas" w:hAnsi="Consolas" w:cs="Consolas"/>
-          <w:sz w:val="22"/>
-          <w:szCs w:val="22"/>
-        </w:rPr>
-        <w:t xml:space="preserve"> Minutes)</w:t>
+        <w:t>(5 Minutes)</w:t>
       </w:r>
     </w:p>
     <w:p>
@@ -539,7 +531,7 @@
           <w:sz w:val="22"/>
           <w:szCs w:val="22"/>
         </w:rPr>
-        <w:t>5</w:t>
+        <w:t>10</w:t>
       </w:r>
       <w:r>
         <w:rPr>
@@ -633,6 +625,14 @@
         </w:rPr>
         <w:t>For the simplest way to get all of the resources for the course, click “Code” and Download ZIP. This will download all of the files as a ZIP folder.</w:t>
       </w:r>
+      <w:r>
+        <w:rPr>
+          <w:rFonts w:ascii="Consolas" w:hAnsi="Consolas" w:cs="Consolas"/>
+          <w:sz w:val="20"/>
+          <w:szCs w:val="20"/>
+        </w:rPr>
+        <w:t xml:space="preserve"> Extract the ZIP and place it in a safe spot.</w:t>
+      </w:r>
     </w:p>
     <w:p>
       <w:pPr>
@@ -754,6 +754,14 @@
         </w:rPr>
         <w:t>Default opens to New Project screen. In future, go to “File-&gt;New Project.” Choose “Plugin-&gt;Basic.” Add your plugin’s name in Project Name. Should have no spaces. Recommend leaving all modules as they are. Choose Xcode as exporter if on Mac, Visual Studio if on Windows. Press “Create Project.”</w:t>
       </w:r>
+      <w:r>
+        <w:rPr>
+          <w:rFonts w:ascii="Consolas" w:hAnsi="Consolas" w:cs="Consolas"/>
+          <w:sz w:val="20"/>
+          <w:szCs w:val="20"/>
+        </w:rPr>
+        <w:t xml:space="preserve"> Then, choose where you would like your project to be saved. I recommend creating a dedicated Plugins or Projects folder next to the course folder we downloaded. </w:t>
+      </w:r>
     </w:p>
     <w:p>
       <w:pPr>
@@ -784,10 +792,99 @@
       <w:pPr>
         <w:rPr>
           <w:rFonts w:ascii="Consolas" w:hAnsi="Consolas" w:cs="Consolas"/>
-          <w:sz w:val="22"/>
-          <w:szCs w:val="22"/>
-        </w:rPr>
-      </w:pPr>
+          <w:sz w:val="20"/>
+          <w:szCs w:val="20"/>
+        </w:rPr>
+      </w:pPr>
+      <w:r>
+        <w:rPr>
+          <w:rFonts w:ascii="Consolas" w:hAnsi="Consolas" w:cs="Consolas"/>
+          <w:sz w:val="20"/>
+          <w:szCs w:val="20"/>
+        </w:rPr>
+        <w:tab/>
+        <w:t xml:space="preserve">Open the </w:t>
+      </w:r>
+      <w:proofErr w:type="spellStart"/>
+      <w:r>
+        <w:rPr>
+          <w:rFonts w:ascii="Consolas" w:hAnsi="Consolas" w:cs="Consolas"/>
+          <w:sz w:val="20"/>
+          <w:szCs w:val="20"/>
+        </w:rPr>
+        <w:t>Templates</w:t>
+      </w:r>
+      <w:r>
+        <w:rPr>
+          <w:rFonts w:ascii="Consolas" w:hAnsi="Consolas" w:cs="Consolas"/>
+          <w:sz w:val="20"/>
+          <w:szCs w:val="20"/>
+        </w:rPr>
+        <w:t>_Materials</w:t>
+      </w:r>
+      <w:proofErr w:type="spellEnd"/>
+      <w:r>
+        <w:rPr>
+          <w:rFonts w:ascii="Consolas" w:hAnsi="Consolas" w:cs="Consolas"/>
+          <w:sz w:val="20"/>
+          <w:szCs w:val="20"/>
+        </w:rPr>
+        <w:t xml:space="preserve"> folder from the downloaded folder and open the JUCE_Startup.cpp file. Then, copy </w:t>
+      </w:r>
+      <w:proofErr w:type="spellStart"/>
+      <w:r>
+        <w:rPr>
+          <w:rFonts w:ascii="Consolas" w:hAnsi="Consolas" w:cs="Consolas"/>
+          <w:sz w:val="20"/>
+          <w:szCs w:val="20"/>
+        </w:rPr>
+        <w:t>Basics.h</w:t>
+      </w:r>
+      <w:proofErr w:type="spellEnd"/>
+      <w:r>
+        <w:rPr>
+          <w:rFonts w:ascii="Consolas" w:hAnsi="Consolas" w:cs="Consolas"/>
+          <w:sz w:val="20"/>
+          <w:szCs w:val="20"/>
+        </w:rPr>
+        <w:t xml:space="preserve"> and </w:t>
+      </w:r>
+      <w:proofErr w:type="spellStart"/>
+      <w:r>
+        <w:rPr>
+          <w:rFonts w:ascii="Consolas" w:hAnsi="Consolas" w:cs="Consolas"/>
+          <w:sz w:val="20"/>
+          <w:szCs w:val="20"/>
+        </w:rPr>
+        <w:t>ParameterLayout.h</w:t>
+      </w:r>
+      <w:proofErr w:type="spellEnd"/>
+      <w:r>
+        <w:rPr>
+          <w:rFonts w:ascii="Consolas" w:hAnsi="Consolas" w:cs="Consolas"/>
+          <w:sz w:val="20"/>
+          <w:szCs w:val="20"/>
+        </w:rPr>
+        <w:t xml:space="preserve">. Navigate to the project folder, open the Source folder, and paste the two .h files there. Go back to the </w:t>
+      </w:r>
+      <w:proofErr w:type="spellStart"/>
+      <w:r>
+        <w:rPr>
+          <w:rFonts w:ascii="Consolas" w:hAnsi="Consolas" w:cs="Consolas"/>
+          <w:sz w:val="20"/>
+          <w:szCs w:val="20"/>
+        </w:rPr>
+        <w:t>projucer</w:t>
+      </w:r>
+      <w:proofErr w:type="spellEnd"/>
+      <w:r>
+        <w:rPr>
+          <w:rFonts w:ascii="Consolas" w:hAnsi="Consolas" w:cs="Consolas"/>
+          <w:sz w:val="20"/>
+          <w:szCs w:val="20"/>
+        </w:rPr>
+        <w:t xml:space="preserve"> and click on File Explorer, and then Source. Click the pink + button and choose to Add Existing Files. Then select the two new .h files and press Open. Now click the Xcode logo to open our project.</w:t>
+      </w:r>
     </w:p>
     <w:p>
       <w:pPr>
@@ -902,6 +999,7 @@
           <w:sz w:val="20"/>
           <w:szCs w:val="20"/>
         </w:rPr>
+        <w:lastRenderedPageBreak/>
         <w:tab/>
         <w:t xml:space="preserve">Close Xcode and go back to </w:t>
       </w:r>

</xml_diff>